<commit_message>
feat: replace Outlook exercise with prompt tool
</commit_message>
<xml_diff>
--- a/docs/public/downloads/fictional-follow-up-guidelines.docx
+++ b/docs/public/downloads/fictional-follow-up-guidelines.docx
@@ -16,13 +16,7 @@
         <w:spacing w:after="180"/>
       </w:pPr>
       <w:r>
-        <w:rPr>
-          <w:rFonts w:ascii="Noto Sans Thai" w:hAnsi="Noto Sans Thai" w:eastAsia="Noto Sans Thai"/>
-          <w:b w:val="0"/>
-          <w:color w:val="000000"/>
-          <w:sz w:val="22"/>
-        </w:rPr>
-        <w:t>เอกสารนี้กำหนดวิธีแยกข้อมูลจาก meeting notes และรูปแบบ email follow-up สำหรับการฝึก โดยเน้นความถูกต้อง การระบุสิ่งที่ยังไม่ชัด และ Human Review ก่อนสร้าง Outlook draft</w:t>
+        <w:t>This document defines how to classify meeting notes and format a follow-up brief for training. It emphasizes accuracy, visible gaps, and human review before use.</w:t>
       </w:r>
     </w:p>
     <w:p>
@@ -30,13 +24,7 @@
         <w:spacing w:after="220"/>
       </w:pPr>
       <w:r>
-        <w:rPr>
-          <w:rFonts w:ascii="Noto Sans Thai" w:hAnsi="Noto Sans Thai" w:eastAsia="Noto Sans Thai"/>
-          <w:b/>
-          <w:color w:val="007C83"/>
-          <w:sz w:val="19"/>
-        </w:rPr>
-        <w:t>ข้อมูลทั้งหมดเป็นข้อมูลสมมติสำหรับการฝึกอบรม ไม่ใช่โครงการ บุคคล นโยบาย หรือกระบวนการจริงขององค์กร</w:t>
+        <w:t>All content is synthetic training material. It does not describe a real project, person, policy, or organizational process.</w:t>
       </w:r>
     </w:p>
     <w:p>
@@ -84,16 +72,7 @@
             </w:tcMar>
           </w:tcPr>
           <w:p>
-            <w:pPr>
-              <w:jc w:val="center"/>
-            </w:pPr>
             <w:r>
-              <w:rPr>
-                <w:rFonts w:ascii="Noto Sans Thai" w:hAnsi="Noto Sans Thai" w:eastAsia="Noto Sans Thai"/>
-                <w:b/>
-                <w:color w:val="FFFFFF"/>
-                <w:sz w:val="19"/>
-              </w:rPr>
               <w:t>Category</w:t>
             </w:r>
           </w:p>
@@ -111,16 +90,7 @@
             </w:tcMar>
           </w:tcPr>
           <w:p>
-            <w:pPr>
-              <w:jc w:val="center"/>
-            </w:pPr>
             <w:r>
-              <w:rPr>
-                <w:rFonts w:ascii="Noto Sans Thai" w:hAnsi="Noto Sans Thai" w:eastAsia="Noto Sans Thai"/>
-                <w:b/>
-                <w:color w:val="FFFFFF"/>
-                <w:sz w:val="19"/>
-              </w:rPr>
               <w:t>Use when</w:t>
             </w:r>
           </w:p>
@@ -138,16 +108,7 @@
             </w:tcMar>
           </w:tcPr>
           <w:p>
-            <w:pPr>
-              <w:jc w:val="center"/>
-            </w:pPr>
             <w:r>
-              <w:rPr>
-                <w:rFonts w:ascii="Noto Sans Thai" w:hAnsi="Noto Sans Thai" w:eastAsia="Noto Sans Thai"/>
-                <w:b/>
-                <w:color w:val="FFFFFF"/>
-                <w:sz w:val="19"/>
-              </w:rPr>
               <w:t>Do not do</w:t>
             </w:r>
           </w:p>
@@ -166,16 +127,7 @@
             </w:tcMar>
           </w:tcPr>
           <w:p>
-            <w:pPr>
-              <w:jc w:val="left"/>
-            </w:pPr>
             <w:r>
-              <w:rPr>
-                <w:rFonts w:ascii="Noto Sans Thai" w:hAnsi="Noto Sans Thai" w:eastAsia="Noto Sans Thai"/>
-                <w:b w:val="0"/>
-                <w:color w:val="000000"/>
-                <w:sz w:val="19"/>
-              </w:rPr>
               <w:t>Decision</w:t>
             </w:r>
           </w:p>
@@ -192,17 +144,8 @@
             </w:tcMar>
           </w:tcPr>
           <w:p>
-            <w:pPr>
-              <w:jc w:val="left"/>
-            </w:pPr>
             <w:r>
-              <w:rPr>
-                <w:rFonts w:ascii="Noto Sans Thai" w:hAnsi="Noto Sans Thai" w:eastAsia="Noto Sans Thai"/>
-                <w:b w:val="0"/>
-                <w:color w:val="000000"/>
-                <w:sz w:val="19"/>
-              </w:rPr>
-              <w:t>notes ระบุชัดว่า agreed, approved, confirmed หรือ decided</w:t>
+              <w:t>The notes explicitly say agreed, approved, confirmed, or decided.</w:t>
             </w:r>
           </w:p>
         </w:tc>
@@ -218,17 +161,8 @@
             </w:tcMar>
           </w:tcPr>
           <w:p>
-            <w:pPr>
-              <w:jc w:val="left"/>
-            </w:pPr>
             <w:r>
-              <w:rPr>
-                <w:rFonts w:ascii="Noto Sans Thai" w:hAnsi="Noto Sans Thai" w:eastAsia="Noto Sans Thai"/>
-                <w:b w:val="0"/>
-                <w:color w:val="000000"/>
-                <w:sz w:val="19"/>
-              </w:rPr>
-              <w:t>อย่าเปลี่ยน suggestion หรือ discussion เป็น decision</w:t>
+              <w:t>Do not convert a suggestion or discussion into a decision.</w:t>
             </w:r>
           </w:p>
         </w:tc>
@@ -247,16 +181,7 @@
             <w:shd w:fill="F5F7F9"/>
           </w:tcPr>
           <w:p>
-            <w:pPr>
-              <w:jc w:val="left"/>
-            </w:pPr>
             <w:r>
-              <w:rPr>
-                <w:rFonts w:ascii="Noto Sans Thai" w:hAnsi="Noto Sans Thai" w:eastAsia="Noto Sans Thai"/>
-                <w:b w:val="0"/>
-                <w:color w:val="000000"/>
-                <w:sz w:val="19"/>
-              </w:rPr>
               <w:t>Action item</w:t>
             </w:r>
           </w:p>
@@ -274,17 +199,8 @@
             <w:shd w:fill="F5F7F9"/>
           </w:tcPr>
           <w:p>
-            <w:pPr>
-              <w:jc w:val="left"/>
-            </w:pPr>
             <w:r>
-              <w:rPr>
-                <w:rFonts w:ascii="Noto Sans Thai" w:hAnsi="Noto Sans Thai" w:eastAsia="Noto Sans Thai"/>
-                <w:b w:val="0"/>
-                <w:color w:val="000000"/>
-                <w:sz w:val="19"/>
-              </w:rPr>
-              <w:t>มีงานที่ต้องทำและควรแสดง owner กับ due date</w:t>
+              <w:t>The notes contain work to do; show its owner and due date.</w:t>
             </w:r>
           </w:p>
         </w:tc>
@@ -301,17 +217,8 @@
             <w:shd w:fill="F5F7F9"/>
           </w:tcPr>
           <w:p>
-            <w:pPr>
-              <w:jc w:val="left"/>
-            </w:pPr>
             <w:r>
-              <w:rPr>
-                <w:rFonts w:ascii="Noto Sans Thai" w:hAnsi="Noto Sans Thai" w:eastAsia="Noto Sans Thai"/>
-                <w:b w:val="0"/>
-                <w:color w:val="000000"/>
-                <w:sz w:val="19"/>
-              </w:rPr>
-              <w:t>อย่าเดา owner หรือ due date ที่หายไป</w:t>
+              <w:t>Do not invent a missing owner or due date.</w:t>
             </w:r>
           </w:p>
         </w:tc>
@@ -329,16 +236,7 @@
             </w:tcMar>
           </w:tcPr>
           <w:p>
-            <w:pPr>
-              <w:jc w:val="left"/>
-            </w:pPr>
             <w:r>
-              <w:rPr>
-                <w:rFonts w:ascii="Noto Sans Thai" w:hAnsi="Noto Sans Thai" w:eastAsia="Noto Sans Thai"/>
-                <w:b w:val="0"/>
-                <w:color w:val="000000"/>
-                <w:sz w:val="19"/>
-              </w:rPr>
               <w:t>Open question</w:t>
             </w:r>
           </w:p>
@@ -355,17 +253,8 @@
             </w:tcMar>
           </w:tcPr>
           <w:p>
-            <w:pPr>
-              <w:jc w:val="left"/>
-            </w:pPr>
             <w:r>
-              <w:rPr>
-                <w:rFonts w:ascii="Noto Sans Thai" w:hAnsi="Noto Sans Thai" w:eastAsia="Noto Sans Thai"/>
-                <w:b w:val="0"/>
-                <w:color w:val="000000"/>
-                <w:sz w:val="19"/>
-              </w:rPr>
-              <w:t>ยังต้องการคำตอบหรือการยืนยัน</w:t>
+              <w:t>The team still needs an answer or confirmation.</w:t>
             </w:r>
           </w:p>
         </w:tc>
@@ -381,17 +270,8 @@
             </w:tcMar>
           </w:tcPr>
           <w:p>
-            <w:pPr>
-              <w:jc w:val="left"/>
-            </w:pPr>
             <w:r>
-              <w:rPr>
-                <w:rFonts w:ascii="Noto Sans Thai" w:hAnsi="Noto Sans Thai" w:eastAsia="Noto Sans Thai"/>
-                <w:b w:val="0"/>
-                <w:color w:val="000000"/>
-                <w:sz w:val="19"/>
-              </w:rPr>
-              <w:t>อย่าสร้างคำตอบจากสมมติฐาน</w:t>
+              <w:t>Do not create an answer from an assumption.</w:t>
             </w:r>
           </w:p>
         </w:tc>
@@ -410,16 +290,7 @@
             <w:shd w:fill="F5F7F9"/>
           </w:tcPr>
           <w:p>
-            <w:pPr>
-              <w:jc w:val="left"/>
-            </w:pPr>
             <w:r>
-              <w:rPr>
-                <w:rFonts w:ascii="Noto Sans Thai" w:hAnsi="Noto Sans Thai" w:eastAsia="Noto Sans Thai"/>
-                <w:b w:val="0"/>
-                <w:color w:val="000000"/>
-                <w:sz w:val="19"/>
-              </w:rPr>
               <w:t>Missing information</w:t>
             </w:r>
           </w:p>
@@ -437,17 +308,8 @@
             <w:shd w:fill="F5F7F9"/>
           </w:tcPr>
           <w:p>
-            <w:pPr>
-              <w:jc w:val="left"/>
-            </w:pPr>
             <w:r>
-              <w:rPr>
-                <w:rFonts w:ascii="Noto Sans Thai" w:hAnsi="Noto Sans Thai" w:eastAsia="Noto Sans Thai"/>
-                <w:b w:val="0"/>
-                <w:color w:val="000000"/>
-                <w:sz w:val="19"/>
-              </w:rPr>
-              <w:t>ข้อมูลจำเป็นหายไปหรือขัดแย้งกัน</w:t>
+              <w:t>Required information is absent or conflicting.</w:t>
             </w:r>
           </w:p>
         </w:tc>
@@ -464,17 +326,8 @@
             <w:shd w:fill="F5F7F9"/>
           </w:tcPr>
           <w:p>
-            <w:pPr>
-              <w:jc w:val="left"/>
-            </w:pPr>
             <w:r>
-              <w:rPr>
-                <w:rFonts w:ascii="Noto Sans Thai" w:hAnsi="Noto Sans Thai" w:eastAsia="Noto Sans Thai"/>
-                <w:b w:val="0"/>
-                <w:color w:val="000000"/>
-                <w:sz w:val="19"/>
-              </w:rPr>
-              <w:t>อย่าเลือกข้อมูลด้านใดด้านหนึ่งเอง</w:t>
+              <w:t>Do not choose one side of conflicting information.</w:t>
             </w:r>
           </w:p>
         </w:tc>
@@ -484,13 +337,14 @@
       <w:pPr>
         <w:spacing w:after="20"/>
       </w:pPr>
+      <w:r/>
     </w:p>
     <w:p>
       <w:pPr>
         <w:pStyle w:val="Heading1"/>
       </w:pPr>
       <w:r>
-        <w:t>Follow-up email structure</w:t>
+        <w:t>Follow-up brief structure</w:t>
       </w:r>
     </w:p>
     <w:p>
@@ -498,13 +352,7 @@
         <w:pStyle w:val="ListBullet"/>
       </w:pPr>
       <w:r>
-        <w:rPr>
-          <w:rFonts w:ascii="Noto Sans Thai" w:hAnsi="Noto Sans Thai" w:eastAsia="Noto Sans Thai"/>
-          <w:b w:val="0"/>
-          <w:color w:val="000000"/>
-          <w:sz w:val="21"/>
-        </w:rPr>
-        <w:t>Subject ระบุ project และ meeting date ตามต้นฉบับ</w:t>
+        <w:t>Keep Executive summary to no more than three bullets and use only the reviewed meeting summary.</w:t>
       </w:r>
     </w:p>
     <w:p>
@@ -512,13 +360,7 @@
         <w:pStyle w:val="ListBullet"/>
       </w:pPr>
       <w:r>
-        <w:rPr>
-          <w:rFonts w:ascii="Noto Sans Thai" w:hAnsi="Noto Sans Thai" w:eastAsia="Noto Sans Thai"/>
-          <w:b w:val="0"/>
-          <w:color w:val="000000"/>
-          <w:sz w:val="21"/>
-        </w:rPr>
-        <w:t>เปิดด้วยวัตถุประสงค์ของการติดตามอย่างกระชับ</w:t>
+        <w:t>Show only explicitly agreed, approved, confirmed, or decided items under Confirmed decisions.</w:t>
       </w:r>
     </w:p>
     <w:p>
@@ -526,13 +368,7 @@
         <w:pStyle w:val="ListBullet"/>
       </w:pPr>
       <w:r>
-        <w:rPr>
-          <w:rFonts w:ascii="Noto Sans Thai" w:hAnsi="Noto Sans Thai" w:eastAsia="Noto Sans Thai"/>
-          <w:b w:val="0"/>
-          <w:color w:val="000000"/>
-          <w:sz w:val="21"/>
-        </w:rPr>
-        <w:t>แยก confirmed decisions, action items, missing information และ open questions</w:t>
+        <w:t>Use Task, Owner, Due date, and Review status as the Action tracker columns.</w:t>
       </w:r>
     </w:p>
     <w:p>
@@ -540,13 +376,7 @@
         <w:pStyle w:val="ListBullet"/>
       </w:pPr>
       <w:r>
-        <w:rPr>
-          <w:rFonts w:ascii="Noto Sans Thai" w:hAnsi="Noto Sans Thai" w:eastAsia="Noto Sans Thai"/>
-          <w:b w:val="0"/>
-          <w:color w:val="000000"/>
-          <w:sz w:val="21"/>
-        </w:rPr>
-        <w:t>ขอให้ผู้รับตรวจและแก้ไขข้อมูลก่อนนำไปใช้</w:t>
+        <w:t>Keep Missing information and Open questions separate from confirmed decisions.</w:t>
       </w:r>
     </w:p>
     <w:p>
@@ -554,13 +384,7 @@
         <w:pStyle w:val="ListBullet"/>
       </w:pPr>
       <w:r>
-        <w:rPr>
-          <w:rFonts w:ascii="Noto Sans Thai" w:hAnsi="Noto Sans Thai" w:eastAsia="Noto Sans Thai"/>
-          <w:b w:val="0"/>
-          <w:color w:val="000000"/>
-          <w:sz w:val="21"/>
-        </w:rPr>
-        <w:t>ใช้เฉพาะ training mailbox ที่ผู้สอนอนุมัติ</w:t>
+        <w:t>End with Human review required and ask a person to correct the brief before use.</w:t>
       </w:r>
     </w:p>
     <w:p>
@@ -568,7 +392,7 @@
         <w:pStyle w:val="Heading1"/>
       </w:pPr>
       <w:r>
-        <w:t>Tool safety</w:t>
+        <w:t>Prompt Tool safety</w:t>
       </w:r>
     </w:p>
     <w:p>
@@ -576,13 +400,7 @@
         <w:pStyle w:val="ListBullet"/>
       </w:pPr>
       <w:r>
-        <w:rPr>
-          <w:rFonts w:ascii="Noto Sans Thai" w:hAnsi="Noto Sans Thai" w:eastAsia="Noto Sans Thai"/>
-          <w:b w:val="0"/>
-          <w:color w:val="000000"/>
-          <w:sz w:val="21"/>
-        </w:rPr>
-        <w:t>แสดง To, Subject และ Body summary ก่อนเรียก Tool</w:t>
+        <w:t>Accept only a reviewed meeting summary through the Text input named MeetingSummary.</w:t>
       </w:r>
     </w:p>
     <w:p>
@@ -590,13 +408,7 @@
         <w:pStyle w:val="ListBullet"/>
       </w:pPr>
       <w:r>
-        <w:rPr>
-          <w:rFonts w:ascii="Noto Sans Thai" w:hAnsi="Noto Sans Thai" w:eastAsia="Noto Sans Thai"/>
-          <w:b w:val="0"/>
-          <w:color w:val="000000"/>
-          <w:sz w:val="21"/>
-        </w:rPr>
-        <w:t>สร้าง draft หลังผู้ใช้ยืนยันอย่างชัดเจนเท่านั้น</w:t>
+        <w:t>Use Create Meeting Follow-up Brief only when the user requests a standardized follow-up brief.</w:t>
       </w:r>
     </w:p>
     <w:p>
@@ -604,13 +416,7 @@
         <w:pStyle w:val="ListBullet"/>
       </w:pPr>
       <w:r>
-        <w:rPr>
-          <w:rFonts w:ascii="Noto Sans Thai" w:hAnsi="Noto Sans Thai" w:eastAsia="Noto Sans Thai"/>
-          <w:b w:val="0"/>
-          <w:color w:val="000000"/>
-          <w:sz w:val="21"/>
-        </w:rPr>
-        <w:t>ห้ามใช้ CC, BCC, shared mailbox, distribution list หรือ attachment</w:t>
+        <w:t>Never invent an owner, due date, decision, approval, or completion status.</w:t>
       </w:r>
     </w:p>
     <w:p>
@@ -618,13 +424,7 @@
         <w:pStyle w:val="ListBullet"/>
       </w:pPr>
       <w:r>
-        <w:rPr>
-          <w:rFonts w:ascii="Noto Sans Thai" w:hAnsi="Noto Sans Thai" w:eastAsia="Noto Sans Thai"/>
-          <w:b w:val="0"/>
-          <w:color w:val="000000"/>
-          <w:sz w:val="21"/>
-        </w:rPr>
-        <w:t>ห้ามเพิ่ม send action หรืออ้างว่า email ถูกส่งแล้ว</w:t>
+        <w:t>Never claim that information was saved, sent, published, approved, or used in an external action.</w:t>
       </w:r>
     </w:p>
     <w:p>
@@ -632,13 +432,7 @@
         <w:pStyle w:val="ListBullet"/>
       </w:pPr>
       <w:r>
-        <w:rPr>
-          <w:rFonts w:ascii="Noto Sans Thai" w:hAnsi="Noto Sans Thai" w:eastAsia="Noto Sans Thai"/>
-          <w:b w:val="0"/>
-          <w:color w:val="000000"/>
-          <w:sz w:val="21"/>
-        </w:rPr>
-        <w:t>หยุดและให้คน Review เมื่อมีข้อมูลจริง ข้อมูลอ่อนไหว หรือคำสั่งเกินขอบเขต</w:t>
+        <w:t>Stop for human review when information is real, sensitive, conflicting, or outside the exercise scope.</w:t>
       </w:r>
     </w:p>
     <w:sectPr>
@@ -1039,7 +833,7 @@
       <w:spacing w:after="120" w:line="269" w:lineRule="auto"/>
     </w:pPr>
     <w:rPr>
-      <w:rFonts w:ascii="Noto Sans Thai" w:hAnsi="Noto Sans Thai" w:eastAsia="Noto Sans Thai"/>
+      <w:rFonts w:ascii="Arial Unicode MS" w:hAnsi="Arial Unicode MS" w:eastAsia="Arial Unicode MS" w:cs="Arial Unicode MS"/>
       <w:sz w:val="21"/>
     </w:rPr>
   </w:style>
@@ -1057,6 +851,9 @@
       </w:tabs>
       <w:spacing w:after="0" w:line="240" w:lineRule="auto"/>
     </w:pPr>
+    <w:rPr>
+      <w:rFonts w:ascii="Arial Unicode MS" w:hAnsi="Arial Unicode MS" w:eastAsia="Arial Unicode MS" w:cs="Arial Unicode MS"/>
+    </w:rPr>
   </w:style>
   <w:style w:type="character" w:customStyle="1" w:styleId="HeaderChar">
     <w:name w:val="Header Char"/>
@@ -1064,6 +861,9 @@
     <w:link w:val="Header"/>
     <w:uiPriority w:val="99"/>
     <w:rsid w:val="00E618BF"/>
+    <w:rPr>
+      <w:rFonts w:ascii="Arial Unicode MS" w:hAnsi="Arial Unicode MS" w:eastAsia="Arial Unicode MS" w:cs="Arial Unicode MS"/>
+    </w:rPr>
   </w:style>
   <w:style w:type="paragraph" w:styleId="Footer">
     <w:name w:val="footer"/>
@@ -1079,6 +879,9 @@
       </w:tabs>
       <w:spacing w:after="0" w:line="240" w:lineRule="auto"/>
     </w:pPr>
+    <w:rPr>
+      <w:rFonts w:ascii="Arial Unicode MS" w:hAnsi="Arial Unicode MS" w:eastAsia="Arial Unicode MS" w:cs="Arial Unicode MS"/>
+    </w:rPr>
   </w:style>
   <w:style w:type="character" w:customStyle="1" w:styleId="FooterChar">
     <w:name w:val="Footer Char"/>
@@ -1086,6 +889,9 @@
     <w:link w:val="Footer"/>
     <w:uiPriority w:val="99"/>
     <w:rsid w:val="00E618BF"/>
+    <w:rPr>
+      <w:rFonts w:ascii="Arial Unicode MS" w:hAnsi="Arial Unicode MS" w:eastAsia="Arial Unicode MS" w:cs="Arial Unicode MS"/>
+    </w:rPr>
   </w:style>
   <w:style w:type="paragraph" w:styleId="Heading1">
     <w:name w:val="heading 1"/>
@@ -1102,7 +908,7 @@
       <w:outlineLvl w:val="0"/>
     </w:pPr>
     <w:rPr>
-      <w:rFonts w:asciiTheme="majorHAnsi" w:eastAsiaTheme="majorEastAsia" w:hAnsiTheme="majorHAnsi" w:cstheme="majorBidi" w:ascii="Noto Sans Thai" w:hAnsi="Noto Sans Thai" w:eastAsia="Noto Sans Thai"/>
+      <w:rFonts w:asciiTheme="majorHAnsi" w:eastAsiaTheme="majorEastAsia" w:hAnsiTheme="majorHAnsi" w:cstheme="majorBidi" w:ascii="Arial Unicode MS" w:hAnsi="Arial Unicode MS" w:eastAsia="Arial Unicode MS" w:cs="Arial Unicode MS"/>
       <w:b/>
       <w:bCs/>
       <w:color w:val="17365D"/>
@@ -1126,7 +932,7 @@
       <w:outlineLvl w:val="1"/>
     </w:pPr>
     <w:rPr>
-      <w:rFonts w:asciiTheme="majorHAnsi" w:eastAsiaTheme="majorEastAsia" w:hAnsiTheme="majorHAnsi" w:cstheme="majorBidi" w:ascii="Noto Sans Thai" w:hAnsi="Noto Sans Thai" w:eastAsia="Noto Sans Thai"/>
+      <w:rFonts w:asciiTheme="majorHAnsi" w:eastAsiaTheme="majorEastAsia" w:hAnsiTheme="majorHAnsi" w:cstheme="majorBidi" w:ascii="Arial Unicode MS" w:hAnsi="Arial Unicode MS" w:eastAsia="Arial Unicode MS" w:cs="Arial Unicode MS"/>
       <w:b/>
       <w:bCs/>
       <w:color w:val="007C83"/>
@@ -1150,7 +956,7 @@
       <w:outlineLvl w:val="2"/>
     </w:pPr>
     <w:rPr>
-      <w:rFonts w:asciiTheme="majorHAnsi" w:eastAsiaTheme="majorEastAsia" w:hAnsiTheme="majorHAnsi" w:cstheme="majorBidi"/>
+      <w:rFonts w:asciiTheme="majorHAnsi" w:eastAsiaTheme="majorEastAsia" w:hAnsiTheme="majorHAnsi" w:cstheme="majorBidi" w:ascii="Arial Unicode MS" w:hAnsi="Arial Unicode MS" w:eastAsia="Arial Unicode MS" w:cs="Arial Unicode MS"/>
       <w:b/>
       <w:bCs/>
       <w:color w:val="4F81BD" w:themeColor="accent1"/>
@@ -1173,7 +979,7 @@
       <w:outlineLvl w:val="3"/>
     </w:pPr>
     <w:rPr>
-      <w:rFonts w:asciiTheme="majorHAnsi" w:eastAsiaTheme="majorEastAsia" w:hAnsiTheme="majorHAnsi" w:cstheme="majorBidi"/>
+      <w:rFonts w:asciiTheme="majorHAnsi" w:eastAsiaTheme="majorEastAsia" w:hAnsiTheme="majorHAnsi" w:cstheme="majorBidi" w:ascii="Arial Unicode MS" w:hAnsi="Arial Unicode MS" w:eastAsia="Arial Unicode MS" w:cs="Arial Unicode MS"/>
       <w:b/>
       <w:bCs/>
       <w:i/>
@@ -1198,7 +1004,7 @@
       <w:outlineLvl w:val="4"/>
     </w:pPr>
     <w:rPr>
-      <w:rFonts w:asciiTheme="majorHAnsi" w:eastAsiaTheme="majorEastAsia" w:hAnsiTheme="majorHAnsi" w:cstheme="majorBidi"/>
+      <w:rFonts w:asciiTheme="majorHAnsi" w:eastAsiaTheme="majorEastAsia" w:hAnsiTheme="majorHAnsi" w:cstheme="majorBidi" w:ascii="Arial Unicode MS" w:hAnsi="Arial Unicode MS" w:eastAsia="Arial Unicode MS" w:cs="Arial Unicode MS"/>
       <w:color w:val="243F60" w:themeColor="accent1" w:themeShade="7F"/>
     </w:rPr>
   </w:style>
@@ -1219,7 +1025,7 @@
       <w:outlineLvl w:val="5"/>
     </w:pPr>
     <w:rPr>
-      <w:rFonts w:asciiTheme="majorHAnsi" w:eastAsiaTheme="majorEastAsia" w:hAnsiTheme="majorHAnsi" w:cstheme="majorBidi"/>
+      <w:rFonts w:asciiTheme="majorHAnsi" w:eastAsiaTheme="majorEastAsia" w:hAnsiTheme="majorHAnsi" w:cstheme="majorBidi" w:ascii="Arial Unicode MS" w:hAnsi="Arial Unicode MS" w:eastAsia="Arial Unicode MS" w:cs="Arial Unicode MS"/>
       <w:i/>
       <w:iCs/>
       <w:color w:val="243F60" w:themeColor="accent1" w:themeShade="7F"/>
@@ -1242,7 +1048,7 @@
       <w:outlineLvl w:val="6"/>
     </w:pPr>
     <w:rPr>
-      <w:rFonts w:asciiTheme="majorHAnsi" w:eastAsiaTheme="majorEastAsia" w:hAnsiTheme="majorHAnsi" w:cstheme="majorBidi"/>
+      <w:rFonts w:asciiTheme="majorHAnsi" w:eastAsiaTheme="majorEastAsia" w:hAnsiTheme="majorHAnsi" w:cstheme="majorBidi" w:ascii="Arial Unicode MS" w:hAnsi="Arial Unicode MS" w:eastAsia="Arial Unicode MS" w:cs="Arial Unicode MS"/>
       <w:i/>
       <w:iCs/>
       <w:color w:val="404040" w:themeColor="text1" w:themeTint="BF"/>
@@ -1265,7 +1071,7 @@
       <w:outlineLvl w:val="7"/>
     </w:pPr>
     <w:rPr>
-      <w:rFonts w:asciiTheme="majorHAnsi" w:eastAsiaTheme="majorEastAsia" w:hAnsiTheme="majorHAnsi" w:cstheme="majorBidi"/>
+      <w:rFonts w:asciiTheme="majorHAnsi" w:eastAsiaTheme="majorEastAsia" w:hAnsiTheme="majorHAnsi" w:cstheme="majorBidi" w:ascii="Arial Unicode MS" w:hAnsi="Arial Unicode MS" w:eastAsia="Arial Unicode MS" w:cs="Arial Unicode MS"/>
       <w:color w:val="4F81BD" w:themeColor="accent1"/>
       <w:sz w:val="20"/>
       <w:szCs w:val="20"/>
@@ -1288,7 +1094,7 @@
       <w:outlineLvl w:val="8"/>
     </w:pPr>
     <w:rPr>
-      <w:rFonts w:asciiTheme="majorHAnsi" w:eastAsiaTheme="majorEastAsia" w:hAnsiTheme="majorHAnsi" w:cstheme="majorBidi"/>
+      <w:rFonts w:asciiTheme="majorHAnsi" w:eastAsiaTheme="majorEastAsia" w:hAnsiTheme="majorHAnsi" w:cstheme="majorBidi" w:ascii="Arial Unicode MS" w:hAnsi="Arial Unicode MS" w:eastAsia="Arial Unicode MS" w:cs="Arial Unicode MS"/>
       <w:i/>
       <w:iCs/>
       <w:color w:val="404040" w:themeColor="text1" w:themeTint="BF"/>
@@ -1301,12 +1107,18 @@
     <w:uiPriority w:val="1"/>
     <w:semiHidden/>
     <w:unhideWhenUsed/>
+    <w:rPr>
+      <w:rFonts w:ascii="Arial Unicode MS" w:hAnsi="Arial Unicode MS" w:eastAsia="Arial Unicode MS" w:cs="Arial Unicode MS"/>
+    </w:rPr>
   </w:style>
   <w:style w:type="table" w:default="1" w:styleId="TableNormal">
     <w:name w:val="Normal Table"/>
     <w:uiPriority w:val="99"/>
     <w:semiHidden/>
     <w:unhideWhenUsed/>
+    <w:rPr>
+      <w:rFonts w:ascii="Arial Unicode MS" w:hAnsi="Arial Unicode MS" w:eastAsia="Arial Unicode MS" w:cs="Arial Unicode MS"/>
+    </w:rPr>
     <w:tblPr>
       <w:tblInd w:w="0" w:type="dxa"/>
       <w:tblCellMar>
@@ -1331,6 +1143,9 @@
     <w:pPr>
       <w:spacing w:after="0" w:line="240" w:lineRule="auto"/>
     </w:pPr>
+    <w:rPr>
+      <w:rFonts w:ascii="Arial Unicode MS" w:hAnsi="Arial Unicode MS" w:eastAsia="Arial Unicode MS" w:cs="Arial Unicode MS"/>
+    </w:rPr>
   </w:style>
   <w:style w:type="character" w:customStyle="1" w:styleId="Heading1Char">
     <w:name w:val="Heading 1 Char"/>
@@ -1339,7 +1154,7 @@
     <w:uiPriority w:val="9"/>
     <w:rsid w:val="00FC693F"/>
     <w:rPr>
-      <w:rFonts w:asciiTheme="majorHAnsi" w:eastAsiaTheme="majorEastAsia" w:hAnsiTheme="majorHAnsi" w:cstheme="majorBidi"/>
+      <w:rFonts w:asciiTheme="majorHAnsi" w:eastAsiaTheme="majorEastAsia" w:hAnsiTheme="majorHAnsi" w:cstheme="majorBidi" w:ascii="Arial Unicode MS" w:hAnsi="Arial Unicode MS" w:eastAsia="Arial Unicode MS" w:cs="Arial Unicode MS"/>
       <w:b/>
       <w:bCs/>
       <w:color w:val="365F91" w:themeColor="accent1" w:themeShade="BF"/>
@@ -1354,7 +1169,7 @@
     <w:uiPriority w:val="9"/>
     <w:rsid w:val="00FC693F"/>
     <w:rPr>
-      <w:rFonts w:asciiTheme="majorHAnsi" w:eastAsiaTheme="majorEastAsia" w:hAnsiTheme="majorHAnsi" w:cstheme="majorBidi"/>
+      <w:rFonts w:asciiTheme="majorHAnsi" w:eastAsiaTheme="majorEastAsia" w:hAnsiTheme="majorHAnsi" w:cstheme="majorBidi" w:ascii="Arial Unicode MS" w:hAnsi="Arial Unicode MS" w:eastAsia="Arial Unicode MS" w:cs="Arial Unicode MS"/>
       <w:b/>
       <w:bCs/>
       <w:color w:val="4F81BD" w:themeColor="accent1"/>
@@ -1369,7 +1184,7 @@
     <w:uiPriority w:val="9"/>
     <w:rsid w:val="00FC693F"/>
     <w:rPr>
-      <w:rFonts w:asciiTheme="majorHAnsi" w:eastAsiaTheme="majorEastAsia" w:hAnsiTheme="majorHAnsi" w:cstheme="majorBidi"/>
+      <w:rFonts w:asciiTheme="majorHAnsi" w:eastAsiaTheme="majorEastAsia" w:hAnsiTheme="majorHAnsi" w:cstheme="majorBidi" w:ascii="Arial Unicode MS" w:hAnsi="Arial Unicode MS" w:eastAsia="Arial Unicode MS" w:cs="Arial Unicode MS"/>
       <w:b/>
       <w:bCs/>
       <w:color w:val="4F81BD" w:themeColor="accent1"/>
@@ -1391,7 +1206,7 @@
       <w:contextualSpacing/>
     </w:pPr>
     <w:rPr>
-      <w:rFonts w:asciiTheme="majorHAnsi" w:eastAsiaTheme="majorEastAsia" w:hAnsiTheme="majorHAnsi" w:cstheme="majorBidi" w:ascii="Noto Sans Thai" w:hAnsi="Noto Sans Thai" w:eastAsia="Noto Sans Thai"/>
+      <w:rFonts w:asciiTheme="majorHAnsi" w:eastAsiaTheme="majorEastAsia" w:hAnsiTheme="majorHAnsi" w:cstheme="majorBidi" w:ascii="Arial Unicode MS" w:hAnsi="Arial Unicode MS" w:eastAsia="Arial Unicode MS" w:cs="Arial Unicode MS"/>
       <w:b/>
       <w:color w:val="17365D"/>
       <w:spacing w:val="5"/>
@@ -1407,7 +1222,7 @@
     <w:uiPriority w:val="10"/>
     <w:rsid w:val="00FC693F"/>
     <w:rPr>
-      <w:rFonts w:asciiTheme="majorHAnsi" w:eastAsiaTheme="majorEastAsia" w:hAnsiTheme="majorHAnsi" w:cstheme="majorBidi"/>
+      <w:rFonts w:asciiTheme="majorHAnsi" w:eastAsiaTheme="majorEastAsia" w:hAnsiTheme="majorHAnsi" w:cstheme="majorBidi" w:ascii="Arial Unicode MS" w:hAnsi="Arial Unicode MS" w:eastAsia="Arial Unicode MS" w:cs="Arial Unicode MS"/>
       <w:color w:val="17365D" w:themeColor="text2" w:themeShade="BF"/>
       <w:spacing w:val="5"/>
       <w:kern w:val="28"/>
@@ -1429,7 +1244,7 @@
       </w:numPr>
     </w:pPr>
     <w:rPr>
-      <w:rFonts w:asciiTheme="majorHAnsi" w:eastAsiaTheme="majorEastAsia" w:hAnsiTheme="majorHAnsi" w:cstheme="majorBidi"/>
+      <w:rFonts w:asciiTheme="majorHAnsi" w:eastAsiaTheme="majorEastAsia" w:hAnsiTheme="majorHAnsi" w:cstheme="majorBidi" w:ascii="Arial Unicode MS" w:hAnsi="Arial Unicode MS" w:eastAsia="Arial Unicode MS" w:cs="Arial Unicode MS"/>
       <w:i/>
       <w:iCs/>
       <w:color w:val="4F81BD" w:themeColor="accent1"/>
@@ -1445,7 +1260,7 @@
     <w:uiPriority w:val="11"/>
     <w:rsid w:val="00FC693F"/>
     <w:rPr>
-      <w:rFonts w:asciiTheme="majorHAnsi" w:eastAsiaTheme="majorEastAsia" w:hAnsiTheme="majorHAnsi" w:cstheme="majorBidi"/>
+      <w:rFonts w:asciiTheme="majorHAnsi" w:eastAsiaTheme="majorEastAsia" w:hAnsiTheme="majorHAnsi" w:cstheme="majorBidi" w:ascii="Arial Unicode MS" w:hAnsi="Arial Unicode MS" w:eastAsia="Arial Unicode MS" w:cs="Arial Unicode MS"/>
       <w:i/>
       <w:iCs/>
       <w:color w:val="4F81BD" w:themeColor="accent1"/>
@@ -1464,6 +1279,9 @@
       <w:ind w:left="720"/>
       <w:contextualSpacing/>
     </w:pPr>
+    <w:rPr>
+      <w:rFonts w:ascii="Arial Unicode MS" w:hAnsi="Arial Unicode MS" w:eastAsia="Arial Unicode MS" w:cs="Arial Unicode MS"/>
+    </w:rPr>
   </w:style>
   <w:style w:type="paragraph" w:styleId="BodyText">
     <w:name w:val="Body Text"/>
@@ -1475,6 +1293,9 @@
     <w:pPr>
       <w:spacing w:after="120"/>
     </w:pPr>
+    <w:rPr>
+      <w:rFonts w:ascii="Arial Unicode MS" w:hAnsi="Arial Unicode MS" w:eastAsia="Arial Unicode MS" w:cs="Arial Unicode MS"/>
+    </w:rPr>
   </w:style>
   <w:style w:type="character" w:customStyle="1" w:styleId="BodyTextChar">
     <w:name w:val="Body Text Char"/>
@@ -1482,6 +1303,9 @@
     <w:link w:val="BodyText"/>
     <w:uiPriority w:val="99"/>
     <w:rsid w:val="00AA1D8D"/>
+    <w:rPr>
+      <w:rFonts w:ascii="Arial Unicode MS" w:hAnsi="Arial Unicode MS" w:eastAsia="Arial Unicode MS" w:cs="Arial Unicode MS"/>
+    </w:rPr>
   </w:style>
   <w:style w:type="paragraph" w:styleId="BodyText2">
     <w:name w:val="Body Text 2"/>
@@ -1493,6 +1317,9 @@
     <w:pPr>
       <w:spacing w:after="120" w:line="480" w:lineRule="auto"/>
     </w:pPr>
+    <w:rPr>
+      <w:rFonts w:ascii="Arial Unicode MS" w:hAnsi="Arial Unicode MS" w:eastAsia="Arial Unicode MS" w:cs="Arial Unicode MS"/>
+    </w:rPr>
   </w:style>
   <w:style w:type="character" w:customStyle="1" w:styleId="BodyText2Char">
     <w:name w:val="Body Text 2 Char"/>
@@ -1500,6 +1327,9 @@
     <w:link w:val="BodyText2"/>
     <w:uiPriority w:val="99"/>
     <w:rsid w:val="00AA1D8D"/>
+    <w:rPr>
+      <w:rFonts w:ascii="Arial Unicode MS" w:hAnsi="Arial Unicode MS" w:eastAsia="Arial Unicode MS" w:cs="Arial Unicode MS"/>
+    </w:rPr>
   </w:style>
   <w:style w:type="paragraph" w:styleId="BodyText3">
     <w:name w:val="Body Text 3"/>
@@ -1512,6 +1342,7 @@
       <w:spacing w:after="120"/>
     </w:pPr>
     <w:rPr>
+      <w:rFonts w:ascii="Arial Unicode MS" w:hAnsi="Arial Unicode MS" w:eastAsia="Arial Unicode MS" w:cs="Arial Unicode MS"/>
       <w:sz w:val="16"/>
       <w:szCs w:val="16"/>
     </w:rPr>
@@ -1523,6 +1354,7 @@
     <w:uiPriority w:val="99"/>
     <w:rsid w:val="00AA1D8D"/>
     <w:rPr>
+      <w:rFonts w:ascii="Arial Unicode MS" w:hAnsi="Arial Unicode MS" w:eastAsia="Arial Unicode MS" w:cs="Arial Unicode MS"/>
       <w:sz w:val="16"/>
       <w:szCs w:val="16"/>
     </w:rPr>
@@ -1537,6 +1369,9 @@
       <w:ind w:left="360" w:hanging="360"/>
       <w:contextualSpacing/>
     </w:pPr>
+    <w:rPr>
+      <w:rFonts w:ascii="Arial Unicode MS" w:hAnsi="Arial Unicode MS" w:eastAsia="Arial Unicode MS" w:cs="Arial Unicode MS"/>
+    </w:rPr>
   </w:style>
   <w:style w:type="paragraph" w:styleId="List2">
     <w:name w:val="List 2"/>
@@ -1548,6 +1383,9 @@
       <w:ind w:left="720" w:hanging="360"/>
       <w:contextualSpacing/>
     </w:pPr>
+    <w:rPr>
+      <w:rFonts w:ascii="Arial Unicode MS" w:hAnsi="Arial Unicode MS" w:eastAsia="Arial Unicode MS" w:cs="Arial Unicode MS"/>
+    </w:rPr>
   </w:style>
   <w:style w:type="paragraph" w:styleId="List3">
     <w:name w:val="List 3"/>
@@ -1559,6 +1397,9 @@
       <w:ind w:left="1080" w:hanging="360"/>
       <w:contextualSpacing/>
     </w:pPr>
+    <w:rPr>
+      <w:rFonts w:ascii="Arial Unicode MS" w:hAnsi="Arial Unicode MS" w:eastAsia="Arial Unicode MS" w:cs="Arial Unicode MS"/>
+    </w:rPr>
   </w:style>
   <w:style w:type="paragraph" w:styleId="ListBullet">
     <w:name w:val="List Bullet"/>
@@ -1572,6 +1413,9 @@
       </w:numPr>
       <w:contextualSpacing/>
     </w:pPr>
+    <w:rPr>
+      <w:rFonts w:ascii="Arial Unicode MS" w:hAnsi="Arial Unicode MS" w:eastAsia="Arial Unicode MS" w:cs="Arial Unicode MS"/>
+    </w:rPr>
   </w:style>
   <w:style w:type="paragraph" w:styleId="ListBullet2">
     <w:name w:val="List Bullet 2"/>
@@ -1585,6 +1429,9 @@
       </w:numPr>
       <w:contextualSpacing/>
     </w:pPr>
+    <w:rPr>
+      <w:rFonts w:ascii="Arial Unicode MS" w:hAnsi="Arial Unicode MS" w:eastAsia="Arial Unicode MS" w:cs="Arial Unicode MS"/>
+    </w:rPr>
   </w:style>
   <w:style w:type="paragraph" w:styleId="ListBullet3">
     <w:name w:val="List Bullet 3"/>
@@ -1598,6 +1445,9 @@
       </w:numPr>
       <w:contextualSpacing/>
     </w:pPr>
+    <w:rPr>
+      <w:rFonts w:ascii="Arial Unicode MS" w:hAnsi="Arial Unicode MS" w:eastAsia="Arial Unicode MS" w:cs="Arial Unicode MS"/>
+    </w:rPr>
   </w:style>
   <w:style w:type="paragraph" w:styleId="ListNumber">
     <w:name w:val="List Number"/>
@@ -1611,6 +1461,9 @@
       </w:numPr>
       <w:contextualSpacing/>
     </w:pPr>
+    <w:rPr>
+      <w:rFonts w:ascii="Arial Unicode MS" w:hAnsi="Arial Unicode MS" w:eastAsia="Arial Unicode MS" w:cs="Arial Unicode MS"/>
+    </w:rPr>
   </w:style>
   <w:style w:type="paragraph" w:styleId="ListNumber2">
     <w:name w:val="List Number 2"/>
@@ -1624,6 +1477,9 @@
       </w:numPr>
       <w:contextualSpacing/>
     </w:pPr>
+    <w:rPr>
+      <w:rFonts w:ascii="Arial Unicode MS" w:hAnsi="Arial Unicode MS" w:eastAsia="Arial Unicode MS" w:cs="Arial Unicode MS"/>
+    </w:rPr>
   </w:style>
   <w:style w:type="paragraph" w:styleId="ListNumber3">
     <w:name w:val="List Number 3"/>
@@ -1637,6 +1493,9 @@
       </w:numPr>
       <w:contextualSpacing/>
     </w:pPr>
+    <w:rPr>
+      <w:rFonts w:ascii="Arial Unicode MS" w:hAnsi="Arial Unicode MS" w:eastAsia="Arial Unicode MS" w:cs="Arial Unicode MS"/>
+    </w:rPr>
   </w:style>
   <w:style w:type="paragraph" w:styleId="ListContinue">
     <w:name w:val="List Continue"/>
@@ -1649,6 +1508,9 @@
       <w:ind w:left="360"/>
       <w:contextualSpacing/>
     </w:pPr>
+    <w:rPr>
+      <w:rFonts w:ascii="Arial Unicode MS" w:hAnsi="Arial Unicode MS" w:eastAsia="Arial Unicode MS" w:cs="Arial Unicode MS"/>
+    </w:rPr>
   </w:style>
   <w:style w:type="paragraph" w:styleId="ListContinue2">
     <w:name w:val="List Continue 2"/>
@@ -1661,6 +1523,9 @@
       <w:ind w:left="720"/>
       <w:contextualSpacing/>
     </w:pPr>
+    <w:rPr>
+      <w:rFonts w:ascii="Arial Unicode MS" w:hAnsi="Arial Unicode MS" w:eastAsia="Arial Unicode MS" w:cs="Arial Unicode MS"/>
+    </w:rPr>
   </w:style>
   <w:style w:type="paragraph" w:styleId="ListContinue3">
     <w:name w:val="List Continue 3"/>
@@ -1673,6 +1538,9 @@
       <w:ind w:left="1080"/>
       <w:contextualSpacing/>
     </w:pPr>
+    <w:rPr>
+      <w:rFonts w:ascii="Arial Unicode MS" w:hAnsi="Arial Unicode MS" w:eastAsia="Arial Unicode MS" w:cs="Arial Unicode MS"/>
+    </w:rPr>
   </w:style>
   <w:style w:type="paragraph" w:styleId="MacroText">
     <w:name w:val="macro"/>
@@ -1692,7 +1560,7 @@
       </w:tabs>
     </w:pPr>
     <w:rPr>
-      <w:rFonts w:ascii="Courier" w:hAnsi="Courier"/>
+      <w:rFonts w:ascii="Arial Unicode MS" w:hAnsi="Arial Unicode MS" w:eastAsia="Arial Unicode MS" w:cs="Arial Unicode MS"/>
       <w:sz w:val="20"/>
       <w:szCs w:val="20"/>
     </w:rPr>
@@ -1704,7 +1572,7 @@
     <w:uiPriority w:val="99"/>
     <w:rsid w:val="0029639D"/>
     <w:rPr>
-      <w:rFonts w:ascii="Courier" w:hAnsi="Courier"/>
+      <w:rFonts w:ascii="Arial Unicode MS" w:hAnsi="Arial Unicode MS" w:eastAsia="Arial Unicode MS" w:cs="Arial Unicode MS"/>
       <w:sz w:val="20"/>
       <w:szCs w:val="20"/>
     </w:rPr>
@@ -1718,6 +1586,7 @@
     <w:qFormat/>
     <w:rsid w:val="00FC693F"/>
     <w:rPr>
+      <w:rFonts w:ascii="Arial Unicode MS" w:hAnsi="Arial Unicode MS" w:eastAsia="Arial Unicode MS" w:cs="Arial Unicode MS"/>
       <w:i/>
       <w:iCs/>
       <w:color w:val="000000" w:themeColor="text1"/>
@@ -1730,6 +1599,7 @@
     <w:uiPriority w:val="29"/>
     <w:rsid w:val="00FC693F"/>
     <w:rPr>
+      <w:rFonts w:ascii="Arial Unicode MS" w:hAnsi="Arial Unicode MS" w:eastAsia="Arial Unicode MS" w:cs="Arial Unicode MS"/>
       <w:i/>
       <w:iCs/>
       <w:color w:val="000000" w:themeColor="text1"/>
@@ -1743,7 +1613,7 @@
     <w:semiHidden/>
     <w:rsid w:val="00FC693F"/>
     <w:rPr>
-      <w:rFonts w:asciiTheme="majorHAnsi" w:eastAsiaTheme="majorEastAsia" w:hAnsiTheme="majorHAnsi" w:cstheme="majorBidi"/>
+      <w:rFonts w:asciiTheme="majorHAnsi" w:eastAsiaTheme="majorEastAsia" w:hAnsiTheme="majorHAnsi" w:cstheme="majorBidi" w:ascii="Arial Unicode MS" w:hAnsi="Arial Unicode MS" w:eastAsia="Arial Unicode MS" w:cs="Arial Unicode MS"/>
       <w:b/>
       <w:bCs/>
       <w:i/>
@@ -1759,7 +1629,7 @@
     <w:semiHidden/>
     <w:rsid w:val="00FC693F"/>
     <w:rPr>
-      <w:rFonts w:asciiTheme="majorHAnsi" w:eastAsiaTheme="majorEastAsia" w:hAnsiTheme="majorHAnsi" w:cstheme="majorBidi"/>
+      <w:rFonts w:asciiTheme="majorHAnsi" w:eastAsiaTheme="majorEastAsia" w:hAnsiTheme="majorHAnsi" w:cstheme="majorBidi" w:ascii="Arial Unicode MS" w:hAnsi="Arial Unicode MS" w:eastAsia="Arial Unicode MS" w:cs="Arial Unicode MS"/>
       <w:color w:val="243F60" w:themeColor="accent1" w:themeShade="7F"/>
     </w:rPr>
   </w:style>
@@ -1771,7 +1641,7 @@
     <w:semiHidden/>
     <w:rsid w:val="00FC693F"/>
     <w:rPr>
-      <w:rFonts w:asciiTheme="majorHAnsi" w:eastAsiaTheme="majorEastAsia" w:hAnsiTheme="majorHAnsi" w:cstheme="majorBidi"/>
+      <w:rFonts w:asciiTheme="majorHAnsi" w:eastAsiaTheme="majorEastAsia" w:hAnsiTheme="majorHAnsi" w:cstheme="majorBidi" w:ascii="Arial Unicode MS" w:hAnsi="Arial Unicode MS" w:eastAsia="Arial Unicode MS" w:cs="Arial Unicode MS"/>
       <w:i/>
       <w:iCs/>
       <w:color w:val="243F60" w:themeColor="accent1" w:themeShade="7F"/>
@@ -1785,7 +1655,7 @@
     <w:semiHidden/>
     <w:rsid w:val="00FC693F"/>
     <w:rPr>
-      <w:rFonts w:asciiTheme="majorHAnsi" w:eastAsiaTheme="majorEastAsia" w:hAnsiTheme="majorHAnsi" w:cstheme="majorBidi"/>
+      <w:rFonts w:asciiTheme="majorHAnsi" w:eastAsiaTheme="majorEastAsia" w:hAnsiTheme="majorHAnsi" w:cstheme="majorBidi" w:ascii="Arial Unicode MS" w:hAnsi="Arial Unicode MS" w:eastAsia="Arial Unicode MS" w:cs="Arial Unicode MS"/>
       <w:i/>
       <w:iCs/>
       <w:color w:val="404040" w:themeColor="text1" w:themeTint="BF"/>
@@ -1799,7 +1669,7 @@
     <w:semiHidden/>
     <w:rsid w:val="00FC693F"/>
     <w:rPr>
-      <w:rFonts w:asciiTheme="majorHAnsi" w:eastAsiaTheme="majorEastAsia" w:hAnsiTheme="majorHAnsi" w:cstheme="majorBidi"/>
+      <w:rFonts w:asciiTheme="majorHAnsi" w:eastAsiaTheme="majorEastAsia" w:hAnsiTheme="majorHAnsi" w:cstheme="majorBidi" w:ascii="Arial Unicode MS" w:hAnsi="Arial Unicode MS" w:eastAsia="Arial Unicode MS" w:cs="Arial Unicode MS"/>
       <w:color w:val="4F81BD" w:themeColor="accent1"/>
       <w:sz w:val="20"/>
       <w:szCs w:val="20"/>
@@ -1813,7 +1683,7 @@
     <w:semiHidden/>
     <w:rsid w:val="00FC693F"/>
     <w:rPr>
-      <w:rFonts w:asciiTheme="majorHAnsi" w:eastAsiaTheme="majorEastAsia" w:hAnsiTheme="majorHAnsi" w:cstheme="majorBidi"/>
+      <w:rFonts w:asciiTheme="majorHAnsi" w:eastAsiaTheme="majorEastAsia" w:hAnsiTheme="majorHAnsi" w:cstheme="majorBidi" w:ascii="Arial Unicode MS" w:hAnsi="Arial Unicode MS" w:eastAsia="Arial Unicode MS" w:cs="Arial Unicode MS"/>
       <w:i/>
       <w:iCs/>
       <w:color w:val="404040" w:themeColor="text1" w:themeTint="BF"/>
@@ -1834,6 +1704,7 @@
       <w:spacing w:line="240" w:lineRule="auto"/>
     </w:pPr>
     <w:rPr>
+      <w:rFonts w:ascii="Arial Unicode MS" w:hAnsi="Arial Unicode MS" w:eastAsia="Arial Unicode MS" w:cs="Arial Unicode MS"/>
       <w:b/>
       <w:bCs/>
       <w:color w:val="4F81BD" w:themeColor="accent1"/>
@@ -1848,6 +1719,7 @@
     <w:qFormat/>
     <w:rsid w:val="00FC693F"/>
     <w:rPr>
+      <w:rFonts w:ascii="Arial Unicode MS" w:hAnsi="Arial Unicode MS" w:eastAsia="Arial Unicode MS" w:cs="Arial Unicode MS"/>
       <w:b/>
       <w:bCs/>
     </w:rPr>
@@ -1859,6 +1731,7 @@
     <w:qFormat/>
     <w:rsid w:val="00FC693F"/>
     <w:rPr>
+      <w:rFonts w:ascii="Arial Unicode MS" w:hAnsi="Arial Unicode MS" w:eastAsia="Arial Unicode MS" w:cs="Arial Unicode MS"/>
       <w:i/>
       <w:iCs/>
     </w:rPr>
@@ -1879,6 +1752,7 @@
       <w:ind w:left="936" w:right="936"/>
     </w:pPr>
     <w:rPr>
+      <w:rFonts w:ascii="Arial Unicode MS" w:hAnsi="Arial Unicode MS" w:eastAsia="Arial Unicode MS" w:cs="Arial Unicode MS"/>
       <w:b/>
       <w:bCs/>
       <w:i/>
@@ -1893,6 +1767,7 @@
     <w:uiPriority w:val="30"/>
     <w:rsid w:val="00FC693F"/>
     <w:rPr>
+      <w:rFonts w:ascii="Arial Unicode MS" w:hAnsi="Arial Unicode MS" w:eastAsia="Arial Unicode MS" w:cs="Arial Unicode MS"/>
       <w:b/>
       <w:bCs/>
       <w:i/>
@@ -1907,6 +1782,7 @@
     <w:qFormat/>
     <w:rsid w:val="00FC693F"/>
     <w:rPr>
+      <w:rFonts w:ascii="Arial Unicode MS" w:hAnsi="Arial Unicode MS" w:eastAsia="Arial Unicode MS" w:cs="Arial Unicode MS"/>
       <w:i/>
       <w:iCs/>
       <w:color w:val="808080" w:themeColor="text1" w:themeTint="7F"/>
@@ -1919,6 +1795,7 @@
     <w:qFormat/>
     <w:rsid w:val="00FC693F"/>
     <w:rPr>
+      <w:rFonts w:ascii="Arial Unicode MS" w:hAnsi="Arial Unicode MS" w:eastAsia="Arial Unicode MS" w:cs="Arial Unicode MS"/>
       <w:b/>
       <w:bCs/>
       <w:i/>
@@ -1933,6 +1810,7 @@
     <w:qFormat/>
     <w:rsid w:val="00FC693F"/>
     <w:rPr>
+      <w:rFonts w:ascii="Arial Unicode MS" w:hAnsi="Arial Unicode MS" w:eastAsia="Arial Unicode MS" w:cs="Arial Unicode MS"/>
       <w:smallCaps/>
       <w:color w:val="C0504D" w:themeColor="accent2"/>
       <w:u w:val="single"/>
@@ -1945,6 +1823,7 @@
     <w:qFormat/>
     <w:rsid w:val="00FC693F"/>
     <w:rPr>
+      <w:rFonts w:ascii="Arial Unicode MS" w:hAnsi="Arial Unicode MS" w:eastAsia="Arial Unicode MS" w:cs="Arial Unicode MS"/>
       <w:b/>
       <w:bCs/>
       <w:smallCaps/>
@@ -1960,6 +1839,7 @@
     <w:qFormat/>
     <w:rsid w:val="00FC693F"/>
     <w:rPr>
+      <w:rFonts w:ascii="Arial Unicode MS" w:hAnsi="Arial Unicode MS" w:eastAsia="Arial Unicode MS" w:cs="Arial Unicode MS"/>
       <w:b/>
       <w:bCs/>
       <w:smallCaps/>
@@ -1978,6 +1858,9 @@
     <w:pPr>
       <w:outlineLvl w:val="9"/>
     </w:pPr>
+    <w:rPr>
+      <w:rFonts w:ascii="Arial Unicode MS" w:hAnsi="Arial Unicode MS" w:eastAsia="Arial Unicode MS" w:cs="Arial Unicode MS"/>
+    </w:rPr>
   </w:style>
   <w:style w:type="table" w:styleId="TableGrid">
     <w:name w:val="Table Grid"/>
@@ -1987,6 +1870,9 @@
     <w:pPr>
       <w:spacing w:after="0" w:line="240" w:lineRule="auto"/>
     </w:pPr>
+    <w:rPr>
+      <w:rFonts w:ascii="Arial Unicode MS" w:hAnsi="Arial Unicode MS" w:eastAsia="Arial Unicode MS" w:cs="Arial Unicode MS"/>
+    </w:rPr>
     <w:tblPr>
       <w:tblInd w:w="0" w:type="dxa"/>
       <w:tblBorders>
@@ -2014,6 +1900,7 @@
       <w:spacing w:after="0" w:line="240" w:lineRule="auto"/>
     </w:pPr>
     <w:rPr>
+      <w:rFonts w:ascii="Arial Unicode MS" w:hAnsi="Arial Unicode MS" w:eastAsia="Arial Unicode MS" w:cs="Arial Unicode MS"/>
       <w:color w:val="000000" w:themeColor="text1" w:themeShade="BF"/>
     </w:rPr>
     <w:tblPr>
@@ -2117,6 +2004,7 @@
       <w:spacing w:after="0" w:line="240" w:lineRule="auto"/>
     </w:pPr>
     <w:rPr>
+      <w:rFonts w:ascii="Arial Unicode MS" w:hAnsi="Arial Unicode MS" w:eastAsia="Arial Unicode MS" w:cs="Arial Unicode MS"/>
       <w:color w:val="365F91" w:themeColor="accent1" w:themeShade="BF"/>
     </w:rPr>
     <w:tblPr>
@@ -2220,6 +2108,7 @@
       <w:spacing w:after="0" w:line="240" w:lineRule="auto"/>
     </w:pPr>
     <w:rPr>
+      <w:rFonts w:ascii="Arial Unicode MS" w:hAnsi="Arial Unicode MS" w:eastAsia="Arial Unicode MS" w:cs="Arial Unicode MS"/>
       <w:color w:val="943634" w:themeColor="accent2" w:themeShade="BF"/>
     </w:rPr>
     <w:tblPr>
@@ -2323,6 +2212,7 @@
       <w:spacing w:after="0" w:line="240" w:lineRule="auto"/>
     </w:pPr>
     <w:rPr>
+      <w:rFonts w:ascii="Arial Unicode MS" w:hAnsi="Arial Unicode MS" w:eastAsia="Arial Unicode MS" w:cs="Arial Unicode MS"/>
       <w:color w:val="76923C" w:themeColor="accent3" w:themeShade="BF"/>
     </w:rPr>
     <w:tblPr>
@@ -2426,6 +2316,7 @@
       <w:spacing w:after="0" w:line="240" w:lineRule="auto"/>
     </w:pPr>
     <w:rPr>
+      <w:rFonts w:ascii="Arial Unicode MS" w:hAnsi="Arial Unicode MS" w:eastAsia="Arial Unicode MS" w:cs="Arial Unicode MS"/>
       <w:color w:val="5F497A" w:themeColor="accent4" w:themeShade="BF"/>
     </w:rPr>
     <w:tblPr>
@@ -2529,6 +2420,7 @@
       <w:spacing w:after="0" w:line="240" w:lineRule="auto"/>
     </w:pPr>
     <w:rPr>
+      <w:rFonts w:ascii="Arial Unicode MS" w:hAnsi="Arial Unicode MS" w:eastAsia="Arial Unicode MS" w:cs="Arial Unicode MS"/>
       <w:color w:val="31849B" w:themeColor="accent5" w:themeShade="BF"/>
     </w:rPr>
     <w:tblPr>
@@ -2632,6 +2524,7 @@
       <w:spacing w:after="0" w:line="240" w:lineRule="auto"/>
     </w:pPr>
     <w:rPr>
+      <w:rFonts w:ascii="Arial Unicode MS" w:hAnsi="Arial Unicode MS" w:eastAsia="Arial Unicode MS" w:cs="Arial Unicode MS"/>
       <w:color w:val="E36C0A" w:themeColor="accent6" w:themeShade="BF"/>
     </w:rPr>
     <w:tblPr>
@@ -2734,6 +2627,9 @@
     <w:pPr>
       <w:spacing w:after="0" w:line="240" w:lineRule="auto"/>
     </w:pPr>
+    <w:rPr>
+      <w:rFonts w:ascii="Arial Unicode MS" w:hAnsi="Arial Unicode MS" w:eastAsia="Arial Unicode MS" w:cs="Arial Unicode MS"/>
+    </w:rPr>
     <w:tblPr>
       <w:tblStyleRowBandSize w:val="1"/>
       <w:tblStyleColBandSize w:val="1"/>
@@ -2826,6 +2722,9 @@
     <w:pPr>
       <w:spacing w:after="0" w:line="240" w:lineRule="auto"/>
     </w:pPr>
+    <w:rPr>
+      <w:rFonts w:ascii="Arial Unicode MS" w:hAnsi="Arial Unicode MS" w:eastAsia="Arial Unicode MS" w:cs="Arial Unicode MS"/>
+    </w:rPr>
     <w:tblPr>
       <w:tblStyleRowBandSize w:val="1"/>
       <w:tblStyleColBandSize w:val="1"/>
@@ -2918,6 +2817,9 @@
     <w:pPr>
       <w:spacing w:after="0" w:line="240" w:lineRule="auto"/>
     </w:pPr>
+    <w:rPr>
+      <w:rFonts w:ascii="Arial Unicode MS" w:hAnsi="Arial Unicode MS" w:eastAsia="Arial Unicode MS" w:cs="Arial Unicode MS"/>
+    </w:rPr>
     <w:tblPr>
       <w:tblStyleRowBandSize w:val="1"/>
       <w:tblStyleColBandSize w:val="1"/>
@@ -3010,6 +2912,9 @@
     <w:pPr>
       <w:spacing w:after="0" w:line="240" w:lineRule="auto"/>
     </w:pPr>
+    <w:rPr>
+      <w:rFonts w:ascii="Arial Unicode MS" w:hAnsi="Arial Unicode MS" w:eastAsia="Arial Unicode MS" w:cs="Arial Unicode MS"/>
+    </w:rPr>
     <w:tblPr>
       <w:tblStyleRowBandSize w:val="1"/>
       <w:tblStyleColBandSize w:val="1"/>
@@ -3102,6 +3007,9 @@
     <w:pPr>
       <w:spacing w:after="0" w:line="240" w:lineRule="auto"/>
     </w:pPr>
+    <w:rPr>
+      <w:rFonts w:ascii="Arial Unicode MS" w:hAnsi="Arial Unicode MS" w:eastAsia="Arial Unicode MS" w:cs="Arial Unicode MS"/>
+    </w:rPr>
     <w:tblPr>
       <w:tblStyleRowBandSize w:val="1"/>
       <w:tblStyleColBandSize w:val="1"/>
@@ -3194,6 +3102,9 @@
     <w:pPr>
       <w:spacing w:after="0" w:line="240" w:lineRule="auto"/>
     </w:pPr>
+    <w:rPr>
+      <w:rFonts w:ascii="Arial Unicode MS" w:hAnsi="Arial Unicode MS" w:eastAsia="Arial Unicode MS" w:cs="Arial Unicode MS"/>
+    </w:rPr>
     <w:tblPr>
       <w:tblStyleRowBandSize w:val="1"/>
       <w:tblStyleColBandSize w:val="1"/>
@@ -3286,6 +3197,9 @@
     <w:pPr>
       <w:spacing w:after="0" w:line="240" w:lineRule="auto"/>
     </w:pPr>
+    <w:rPr>
+      <w:rFonts w:ascii="Arial Unicode MS" w:hAnsi="Arial Unicode MS" w:eastAsia="Arial Unicode MS" w:cs="Arial Unicode MS"/>
+    </w:rPr>
     <w:tblPr>
       <w:tblStyleRowBandSize w:val="1"/>
       <w:tblStyleColBandSize w:val="1"/>
@@ -3378,6 +3292,9 @@
     <w:pPr>
       <w:spacing w:after="0" w:line="240" w:lineRule="auto"/>
     </w:pPr>
+    <w:rPr>
+      <w:rFonts w:ascii="Arial Unicode MS" w:hAnsi="Arial Unicode MS" w:eastAsia="Arial Unicode MS" w:cs="Arial Unicode MS"/>
+    </w:rPr>
     <w:tblPr>
       <w:tblStyleRowBandSize w:val="1"/>
       <w:tblStyleColBandSize w:val="1"/>
@@ -3508,6 +3425,9 @@
     <w:pPr>
       <w:spacing w:after="0" w:line="240" w:lineRule="auto"/>
     </w:pPr>
+    <w:rPr>
+      <w:rFonts w:ascii="Arial Unicode MS" w:hAnsi="Arial Unicode MS" w:eastAsia="Arial Unicode MS" w:cs="Arial Unicode MS"/>
+    </w:rPr>
     <w:tblPr>
       <w:tblStyleRowBandSize w:val="1"/>
       <w:tblStyleColBandSize w:val="1"/>
@@ -3638,6 +3558,9 @@
     <w:pPr>
       <w:spacing w:after="0" w:line="240" w:lineRule="auto"/>
     </w:pPr>
+    <w:rPr>
+      <w:rFonts w:ascii="Arial Unicode MS" w:hAnsi="Arial Unicode MS" w:eastAsia="Arial Unicode MS" w:cs="Arial Unicode MS"/>
+    </w:rPr>
     <w:tblPr>
       <w:tblStyleRowBandSize w:val="1"/>
       <w:tblStyleColBandSize w:val="1"/>
@@ -3768,6 +3691,9 @@
     <w:pPr>
       <w:spacing w:after="0" w:line="240" w:lineRule="auto"/>
     </w:pPr>
+    <w:rPr>
+      <w:rFonts w:ascii="Arial Unicode MS" w:hAnsi="Arial Unicode MS" w:eastAsia="Arial Unicode MS" w:cs="Arial Unicode MS"/>
+    </w:rPr>
     <w:tblPr>
       <w:tblStyleRowBandSize w:val="1"/>
       <w:tblStyleColBandSize w:val="1"/>
@@ -3898,6 +3824,9 @@
     <w:pPr>
       <w:spacing w:after="0" w:line="240" w:lineRule="auto"/>
     </w:pPr>
+    <w:rPr>
+      <w:rFonts w:ascii="Arial Unicode MS" w:hAnsi="Arial Unicode MS" w:eastAsia="Arial Unicode MS" w:cs="Arial Unicode MS"/>
+    </w:rPr>
     <w:tblPr>
       <w:tblStyleRowBandSize w:val="1"/>
       <w:tblStyleColBandSize w:val="1"/>
@@ -4028,6 +3957,9 @@
     <w:pPr>
       <w:spacing w:after="0" w:line="240" w:lineRule="auto"/>
     </w:pPr>
+    <w:rPr>
+      <w:rFonts w:ascii="Arial Unicode MS" w:hAnsi="Arial Unicode MS" w:eastAsia="Arial Unicode MS" w:cs="Arial Unicode MS"/>
+    </w:rPr>
     <w:tblPr>
       <w:tblStyleRowBandSize w:val="1"/>
       <w:tblStyleColBandSize w:val="1"/>
@@ -4158,6 +4090,9 @@
     <w:pPr>
       <w:spacing w:after="0" w:line="240" w:lineRule="auto"/>
     </w:pPr>
+    <w:rPr>
+      <w:rFonts w:ascii="Arial Unicode MS" w:hAnsi="Arial Unicode MS" w:eastAsia="Arial Unicode MS" w:cs="Arial Unicode MS"/>
+    </w:rPr>
     <w:tblPr>
       <w:tblStyleRowBandSize w:val="1"/>
       <w:tblStyleColBandSize w:val="1"/>
@@ -4288,6 +4223,9 @@
     <w:pPr>
       <w:spacing w:after="0" w:line="240" w:lineRule="auto"/>
     </w:pPr>
+    <w:rPr>
+      <w:rFonts w:ascii="Arial Unicode MS" w:hAnsi="Arial Unicode MS" w:eastAsia="Arial Unicode MS" w:cs="Arial Unicode MS"/>
+    </w:rPr>
     <w:tblPr>
       <w:tblStyleRowBandSize w:val="1"/>
       <w:tblStyleColBandSize w:val="1"/>
@@ -4394,6 +4332,9 @@
     <w:pPr>
       <w:spacing w:after="0" w:line="240" w:lineRule="auto"/>
     </w:pPr>
+    <w:rPr>
+      <w:rFonts w:ascii="Arial Unicode MS" w:hAnsi="Arial Unicode MS" w:eastAsia="Arial Unicode MS" w:cs="Arial Unicode MS"/>
+    </w:rPr>
     <w:tblPr>
       <w:tblStyleRowBandSize w:val="1"/>
       <w:tblStyleColBandSize w:val="1"/>
@@ -4500,6 +4441,9 @@
     <w:pPr>
       <w:spacing w:after="0" w:line="240" w:lineRule="auto"/>
     </w:pPr>
+    <w:rPr>
+      <w:rFonts w:ascii="Arial Unicode MS" w:hAnsi="Arial Unicode MS" w:eastAsia="Arial Unicode MS" w:cs="Arial Unicode MS"/>
+    </w:rPr>
     <w:tblPr>
       <w:tblStyleRowBandSize w:val="1"/>
       <w:tblStyleColBandSize w:val="1"/>
@@ -4606,6 +4550,9 @@
     <w:pPr>
       <w:spacing w:after="0" w:line="240" w:lineRule="auto"/>
     </w:pPr>
+    <w:rPr>
+      <w:rFonts w:ascii="Arial Unicode MS" w:hAnsi="Arial Unicode MS" w:eastAsia="Arial Unicode MS" w:cs="Arial Unicode MS"/>
+    </w:rPr>
     <w:tblPr>
       <w:tblStyleRowBandSize w:val="1"/>
       <w:tblStyleColBandSize w:val="1"/>
@@ -4712,6 +4659,9 @@
     <w:pPr>
       <w:spacing w:after="0" w:line="240" w:lineRule="auto"/>
     </w:pPr>
+    <w:rPr>
+      <w:rFonts w:ascii="Arial Unicode MS" w:hAnsi="Arial Unicode MS" w:eastAsia="Arial Unicode MS" w:cs="Arial Unicode MS"/>
+    </w:rPr>
     <w:tblPr>
       <w:tblStyleRowBandSize w:val="1"/>
       <w:tblStyleColBandSize w:val="1"/>
@@ -4818,6 +4768,9 @@
     <w:pPr>
       <w:spacing w:after="0" w:line="240" w:lineRule="auto"/>
     </w:pPr>
+    <w:rPr>
+      <w:rFonts w:ascii="Arial Unicode MS" w:hAnsi="Arial Unicode MS" w:eastAsia="Arial Unicode MS" w:cs="Arial Unicode MS"/>
+    </w:rPr>
     <w:tblPr>
       <w:tblStyleRowBandSize w:val="1"/>
       <w:tblStyleColBandSize w:val="1"/>
@@ -4924,6 +4877,9 @@
     <w:pPr>
       <w:spacing w:after="0" w:line="240" w:lineRule="auto"/>
     </w:pPr>
+    <w:rPr>
+      <w:rFonts w:ascii="Arial Unicode MS" w:hAnsi="Arial Unicode MS" w:eastAsia="Arial Unicode MS" w:cs="Arial Unicode MS"/>
+    </w:rPr>
     <w:tblPr>
       <w:tblStyleRowBandSize w:val="1"/>
       <w:tblStyleColBandSize w:val="1"/>
@@ -5030,6 +4986,9 @@
     <w:pPr>
       <w:spacing w:after="0" w:line="240" w:lineRule="auto"/>
     </w:pPr>
+    <w:rPr>
+      <w:rFonts w:ascii="Arial Unicode MS" w:hAnsi="Arial Unicode MS" w:eastAsia="Arial Unicode MS" w:cs="Arial Unicode MS"/>
+    </w:rPr>
     <w:tblPr>
       <w:tblStyleRowBandSize w:val="1"/>
       <w:tblStyleColBandSize w:val="1"/>
@@ -5179,6 +5138,9 @@
     <w:pPr>
       <w:spacing w:after="0" w:line="240" w:lineRule="auto"/>
     </w:pPr>
+    <w:rPr>
+      <w:rFonts w:ascii="Arial Unicode MS" w:hAnsi="Arial Unicode MS" w:eastAsia="Arial Unicode MS" w:cs="Arial Unicode MS"/>
+    </w:rPr>
     <w:tblPr>
       <w:tblStyleRowBandSize w:val="1"/>
       <w:tblStyleColBandSize w:val="1"/>
@@ -5328,6 +5290,9 @@
     <w:pPr>
       <w:spacing w:after="0" w:line="240" w:lineRule="auto"/>
     </w:pPr>
+    <w:rPr>
+      <w:rFonts w:ascii="Arial Unicode MS" w:hAnsi="Arial Unicode MS" w:eastAsia="Arial Unicode MS" w:cs="Arial Unicode MS"/>
+    </w:rPr>
     <w:tblPr>
       <w:tblStyleRowBandSize w:val="1"/>
       <w:tblStyleColBandSize w:val="1"/>
@@ -5477,6 +5442,9 @@
     <w:pPr>
       <w:spacing w:after="0" w:line="240" w:lineRule="auto"/>
     </w:pPr>
+    <w:rPr>
+      <w:rFonts w:ascii="Arial Unicode MS" w:hAnsi="Arial Unicode MS" w:eastAsia="Arial Unicode MS" w:cs="Arial Unicode MS"/>
+    </w:rPr>
     <w:tblPr>
       <w:tblStyleRowBandSize w:val="1"/>
       <w:tblStyleColBandSize w:val="1"/>
@@ -5626,6 +5594,9 @@
     <w:pPr>
       <w:spacing w:after="0" w:line="240" w:lineRule="auto"/>
     </w:pPr>
+    <w:rPr>
+      <w:rFonts w:ascii="Arial Unicode MS" w:hAnsi="Arial Unicode MS" w:eastAsia="Arial Unicode MS" w:cs="Arial Unicode MS"/>
+    </w:rPr>
     <w:tblPr>
       <w:tblStyleRowBandSize w:val="1"/>
       <w:tblStyleColBandSize w:val="1"/>
@@ -5775,6 +5746,9 @@
     <w:pPr>
       <w:spacing w:after="0" w:line="240" w:lineRule="auto"/>
     </w:pPr>
+    <w:rPr>
+      <w:rFonts w:ascii="Arial Unicode MS" w:hAnsi="Arial Unicode MS" w:eastAsia="Arial Unicode MS" w:cs="Arial Unicode MS"/>
+    </w:rPr>
     <w:tblPr>
       <w:tblStyleRowBandSize w:val="1"/>
       <w:tblStyleColBandSize w:val="1"/>
@@ -5924,6 +5898,9 @@
     <w:pPr>
       <w:spacing w:after="0" w:line="240" w:lineRule="auto"/>
     </w:pPr>
+    <w:rPr>
+      <w:rFonts w:ascii="Arial Unicode MS" w:hAnsi="Arial Unicode MS" w:eastAsia="Arial Unicode MS" w:cs="Arial Unicode MS"/>
+    </w:rPr>
     <w:tblPr>
       <w:tblStyleRowBandSize w:val="1"/>
       <w:tblStyleColBandSize w:val="1"/>
@@ -6074,6 +6051,7 @@
       <w:spacing w:after="0" w:line="240" w:lineRule="auto"/>
     </w:pPr>
     <w:rPr>
+      <w:rFonts w:ascii="Arial Unicode MS" w:hAnsi="Arial Unicode MS" w:eastAsia="Arial Unicode MS" w:cs="Arial Unicode MS"/>
       <w:color w:val="000000" w:themeColor="text1"/>
     </w:rPr>
     <w:tblPr>
@@ -6158,6 +6136,7 @@
       <w:spacing w:after="0" w:line="240" w:lineRule="auto"/>
     </w:pPr>
     <w:rPr>
+      <w:rFonts w:ascii="Arial Unicode MS" w:hAnsi="Arial Unicode MS" w:eastAsia="Arial Unicode MS" w:cs="Arial Unicode MS"/>
       <w:color w:val="000000" w:themeColor="text1"/>
     </w:rPr>
     <w:tblPr>
@@ -6242,6 +6221,7 @@
       <w:spacing w:after="0" w:line="240" w:lineRule="auto"/>
     </w:pPr>
     <w:rPr>
+      <w:rFonts w:ascii="Arial Unicode MS" w:hAnsi="Arial Unicode MS" w:eastAsia="Arial Unicode MS" w:cs="Arial Unicode MS"/>
       <w:color w:val="000000" w:themeColor="text1"/>
     </w:rPr>
     <w:tblPr>
@@ -6326,6 +6306,7 @@
       <w:spacing w:after="0" w:line="240" w:lineRule="auto"/>
     </w:pPr>
     <w:rPr>
+      <w:rFonts w:ascii="Arial Unicode MS" w:hAnsi="Arial Unicode MS" w:eastAsia="Arial Unicode MS" w:cs="Arial Unicode MS"/>
       <w:color w:val="000000" w:themeColor="text1"/>
     </w:rPr>
     <w:tblPr>
@@ -6410,6 +6391,7 @@
       <w:spacing w:after="0" w:line="240" w:lineRule="auto"/>
     </w:pPr>
     <w:rPr>
+      <w:rFonts w:ascii="Arial Unicode MS" w:hAnsi="Arial Unicode MS" w:eastAsia="Arial Unicode MS" w:cs="Arial Unicode MS"/>
       <w:color w:val="000000" w:themeColor="text1"/>
     </w:rPr>
     <w:tblPr>
@@ -6494,6 +6476,7 @@
       <w:spacing w:after="0" w:line="240" w:lineRule="auto"/>
     </w:pPr>
     <w:rPr>
+      <w:rFonts w:ascii="Arial Unicode MS" w:hAnsi="Arial Unicode MS" w:eastAsia="Arial Unicode MS" w:cs="Arial Unicode MS"/>
       <w:color w:val="000000" w:themeColor="text1"/>
     </w:rPr>
     <w:tblPr>
@@ -6578,6 +6561,7 @@
       <w:spacing w:after="0" w:line="240" w:lineRule="auto"/>
     </w:pPr>
     <w:rPr>
+      <w:rFonts w:ascii="Arial Unicode MS" w:hAnsi="Arial Unicode MS" w:eastAsia="Arial Unicode MS" w:cs="Arial Unicode MS"/>
       <w:color w:val="000000" w:themeColor="text1"/>
     </w:rPr>
     <w:tblPr>
@@ -6662,7 +6646,7 @@
       <w:spacing w:after="0" w:line="240" w:lineRule="auto"/>
     </w:pPr>
     <w:rPr>
-      <w:rFonts w:asciiTheme="majorHAnsi" w:eastAsiaTheme="majorEastAsia" w:hAnsiTheme="majorHAnsi" w:cstheme="majorBidi"/>
+      <w:rFonts w:asciiTheme="majorHAnsi" w:eastAsiaTheme="majorEastAsia" w:hAnsiTheme="majorHAnsi" w:cstheme="majorBidi" w:ascii="Arial Unicode MS" w:hAnsi="Arial Unicode MS" w:eastAsia="Arial Unicode MS" w:cs="Arial Unicode MS"/>
       <w:color w:val="000000" w:themeColor="text1"/>
     </w:rPr>
     <w:tblPr>
@@ -6790,7 +6774,7 @@
       <w:spacing w:after="0" w:line="240" w:lineRule="auto"/>
     </w:pPr>
     <w:rPr>
-      <w:rFonts w:asciiTheme="majorHAnsi" w:eastAsiaTheme="majorEastAsia" w:hAnsiTheme="majorHAnsi" w:cstheme="majorBidi"/>
+      <w:rFonts w:asciiTheme="majorHAnsi" w:eastAsiaTheme="majorEastAsia" w:hAnsiTheme="majorHAnsi" w:cstheme="majorBidi" w:ascii="Arial Unicode MS" w:hAnsi="Arial Unicode MS" w:eastAsia="Arial Unicode MS" w:cs="Arial Unicode MS"/>
       <w:color w:val="000000" w:themeColor="text1"/>
     </w:rPr>
     <w:tblPr>
@@ -6918,7 +6902,7 @@
       <w:spacing w:after="0" w:line="240" w:lineRule="auto"/>
     </w:pPr>
     <w:rPr>
-      <w:rFonts w:asciiTheme="majorHAnsi" w:eastAsiaTheme="majorEastAsia" w:hAnsiTheme="majorHAnsi" w:cstheme="majorBidi"/>
+      <w:rFonts w:asciiTheme="majorHAnsi" w:eastAsiaTheme="majorEastAsia" w:hAnsiTheme="majorHAnsi" w:cstheme="majorBidi" w:ascii="Arial Unicode MS" w:hAnsi="Arial Unicode MS" w:eastAsia="Arial Unicode MS" w:cs="Arial Unicode MS"/>
       <w:color w:val="000000" w:themeColor="text1"/>
     </w:rPr>
     <w:tblPr>
@@ -7046,7 +7030,7 @@
       <w:spacing w:after="0" w:line="240" w:lineRule="auto"/>
     </w:pPr>
     <w:rPr>
-      <w:rFonts w:asciiTheme="majorHAnsi" w:eastAsiaTheme="majorEastAsia" w:hAnsiTheme="majorHAnsi" w:cstheme="majorBidi"/>
+      <w:rFonts w:asciiTheme="majorHAnsi" w:eastAsiaTheme="majorEastAsia" w:hAnsiTheme="majorHAnsi" w:cstheme="majorBidi" w:ascii="Arial Unicode MS" w:hAnsi="Arial Unicode MS" w:eastAsia="Arial Unicode MS" w:cs="Arial Unicode MS"/>
       <w:color w:val="000000" w:themeColor="text1"/>
     </w:rPr>
     <w:tblPr>
@@ -7174,7 +7158,7 @@
       <w:spacing w:after="0" w:line="240" w:lineRule="auto"/>
     </w:pPr>
     <w:rPr>
-      <w:rFonts w:asciiTheme="majorHAnsi" w:eastAsiaTheme="majorEastAsia" w:hAnsiTheme="majorHAnsi" w:cstheme="majorBidi"/>
+      <w:rFonts w:asciiTheme="majorHAnsi" w:eastAsiaTheme="majorEastAsia" w:hAnsiTheme="majorHAnsi" w:cstheme="majorBidi" w:ascii="Arial Unicode MS" w:hAnsi="Arial Unicode MS" w:eastAsia="Arial Unicode MS" w:cs="Arial Unicode MS"/>
       <w:color w:val="000000" w:themeColor="text1"/>
     </w:rPr>
     <w:tblPr>
@@ -7302,7 +7286,7 @@
       <w:spacing w:after="0" w:line="240" w:lineRule="auto"/>
     </w:pPr>
     <w:rPr>
-      <w:rFonts w:asciiTheme="majorHAnsi" w:eastAsiaTheme="majorEastAsia" w:hAnsiTheme="majorHAnsi" w:cstheme="majorBidi"/>
+      <w:rFonts w:asciiTheme="majorHAnsi" w:eastAsiaTheme="majorEastAsia" w:hAnsiTheme="majorHAnsi" w:cstheme="majorBidi" w:ascii="Arial Unicode MS" w:hAnsi="Arial Unicode MS" w:eastAsia="Arial Unicode MS" w:cs="Arial Unicode MS"/>
       <w:color w:val="000000" w:themeColor="text1"/>
     </w:rPr>
     <w:tblPr>
@@ -7430,7 +7414,7 @@
       <w:spacing w:after="0" w:line="240" w:lineRule="auto"/>
     </w:pPr>
     <w:rPr>
-      <w:rFonts w:asciiTheme="majorHAnsi" w:eastAsiaTheme="majorEastAsia" w:hAnsiTheme="majorHAnsi" w:cstheme="majorBidi"/>
+      <w:rFonts w:asciiTheme="majorHAnsi" w:eastAsiaTheme="majorEastAsia" w:hAnsiTheme="majorHAnsi" w:cstheme="majorBidi" w:ascii="Arial Unicode MS" w:hAnsi="Arial Unicode MS" w:eastAsia="Arial Unicode MS" w:cs="Arial Unicode MS"/>
       <w:color w:val="000000" w:themeColor="text1"/>
     </w:rPr>
     <w:tblPr>
@@ -7557,6 +7541,9 @@
     <w:pPr>
       <w:spacing w:after="0" w:line="240" w:lineRule="auto"/>
     </w:pPr>
+    <w:rPr>
+      <w:rFonts w:ascii="Arial Unicode MS" w:hAnsi="Arial Unicode MS" w:eastAsia="Arial Unicode MS" w:cs="Arial Unicode MS"/>
+    </w:rPr>
     <w:tblPr>
       <w:tblStyleRowBandSize w:val="1"/>
       <w:tblStyleColBandSize w:val="1"/>
@@ -7630,6 +7617,9 @@
     <w:pPr>
       <w:spacing w:after="0" w:line="240" w:lineRule="auto"/>
     </w:pPr>
+    <w:rPr>
+      <w:rFonts w:ascii="Arial Unicode MS" w:hAnsi="Arial Unicode MS" w:eastAsia="Arial Unicode MS" w:cs="Arial Unicode MS"/>
+    </w:rPr>
     <w:tblPr>
       <w:tblStyleRowBandSize w:val="1"/>
       <w:tblStyleColBandSize w:val="1"/>
@@ -7703,6 +7693,9 @@
     <w:pPr>
       <w:spacing w:after="0" w:line="240" w:lineRule="auto"/>
     </w:pPr>
+    <w:rPr>
+      <w:rFonts w:ascii="Arial Unicode MS" w:hAnsi="Arial Unicode MS" w:eastAsia="Arial Unicode MS" w:cs="Arial Unicode MS"/>
+    </w:rPr>
     <w:tblPr>
       <w:tblStyleRowBandSize w:val="1"/>
       <w:tblStyleColBandSize w:val="1"/>
@@ -7776,6 +7769,9 @@
     <w:pPr>
       <w:spacing w:after="0" w:line="240" w:lineRule="auto"/>
     </w:pPr>
+    <w:rPr>
+      <w:rFonts w:ascii="Arial Unicode MS" w:hAnsi="Arial Unicode MS" w:eastAsia="Arial Unicode MS" w:cs="Arial Unicode MS"/>
+    </w:rPr>
     <w:tblPr>
       <w:tblStyleRowBandSize w:val="1"/>
       <w:tblStyleColBandSize w:val="1"/>
@@ -7849,6 +7845,9 @@
     <w:pPr>
       <w:spacing w:after="0" w:line="240" w:lineRule="auto"/>
     </w:pPr>
+    <w:rPr>
+      <w:rFonts w:ascii="Arial Unicode MS" w:hAnsi="Arial Unicode MS" w:eastAsia="Arial Unicode MS" w:cs="Arial Unicode MS"/>
+    </w:rPr>
     <w:tblPr>
       <w:tblStyleRowBandSize w:val="1"/>
       <w:tblStyleColBandSize w:val="1"/>
@@ -7922,6 +7921,9 @@
     <w:pPr>
       <w:spacing w:after="0" w:line="240" w:lineRule="auto"/>
     </w:pPr>
+    <w:rPr>
+      <w:rFonts w:ascii="Arial Unicode MS" w:hAnsi="Arial Unicode MS" w:eastAsia="Arial Unicode MS" w:cs="Arial Unicode MS"/>
+    </w:rPr>
     <w:tblPr>
       <w:tblStyleRowBandSize w:val="1"/>
       <w:tblStyleColBandSize w:val="1"/>
@@ -7995,6 +7997,9 @@
     <w:pPr>
       <w:spacing w:after="0" w:line="240" w:lineRule="auto"/>
     </w:pPr>
+    <w:rPr>
+      <w:rFonts w:ascii="Arial Unicode MS" w:hAnsi="Arial Unicode MS" w:eastAsia="Arial Unicode MS" w:cs="Arial Unicode MS"/>
+    </w:rPr>
     <w:tblPr>
       <w:tblStyleRowBandSize w:val="1"/>
       <w:tblStyleColBandSize w:val="1"/>
@@ -8069,7 +8074,7 @@
       <w:spacing w:after="0" w:line="240" w:lineRule="auto"/>
     </w:pPr>
     <w:rPr>
-      <w:rFonts w:asciiTheme="majorHAnsi" w:eastAsiaTheme="majorEastAsia" w:hAnsiTheme="majorHAnsi" w:cstheme="majorBidi"/>
+      <w:rFonts w:asciiTheme="majorHAnsi" w:eastAsiaTheme="majorEastAsia" w:hAnsiTheme="majorHAnsi" w:cstheme="majorBidi" w:ascii="Arial Unicode MS" w:hAnsi="Arial Unicode MS" w:eastAsia="Arial Unicode MS" w:cs="Arial Unicode MS"/>
       <w:color w:val="000000" w:themeColor="text1"/>
     </w:rPr>
     <w:tblPr>
@@ -8194,7 +8199,7 @@
       <w:spacing w:after="0" w:line="240" w:lineRule="auto"/>
     </w:pPr>
     <w:rPr>
-      <w:rFonts w:asciiTheme="majorHAnsi" w:eastAsiaTheme="majorEastAsia" w:hAnsiTheme="majorHAnsi" w:cstheme="majorBidi"/>
+      <w:rFonts w:asciiTheme="majorHAnsi" w:eastAsiaTheme="majorEastAsia" w:hAnsiTheme="majorHAnsi" w:cstheme="majorBidi" w:ascii="Arial Unicode MS" w:hAnsi="Arial Unicode MS" w:eastAsia="Arial Unicode MS" w:cs="Arial Unicode MS"/>
       <w:color w:val="000000" w:themeColor="text1"/>
     </w:rPr>
     <w:tblPr>
@@ -8319,7 +8324,7 @@
       <w:spacing w:after="0" w:line="240" w:lineRule="auto"/>
     </w:pPr>
     <w:rPr>
-      <w:rFonts w:asciiTheme="majorHAnsi" w:eastAsiaTheme="majorEastAsia" w:hAnsiTheme="majorHAnsi" w:cstheme="majorBidi"/>
+      <w:rFonts w:asciiTheme="majorHAnsi" w:eastAsiaTheme="majorEastAsia" w:hAnsiTheme="majorHAnsi" w:cstheme="majorBidi" w:ascii="Arial Unicode MS" w:hAnsi="Arial Unicode MS" w:eastAsia="Arial Unicode MS" w:cs="Arial Unicode MS"/>
       <w:color w:val="000000" w:themeColor="text1"/>
     </w:rPr>
     <w:tblPr>
@@ -8444,7 +8449,7 @@
       <w:spacing w:after="0" w:line="240" w:lineRule="auto"/>
     </w:pPr>
     <w:rPr>
-      <w:rFonts w:asciiTheme="majorHAnsi" w:eastAsiaTheme="majorEastAsia" w:hAnsiTheme="majorHAnsi" w:cstheme="majorBidi"/>
+      <w:rFonts w:asciiTheme="majorHAnsi" w:eastAsiaTheme="majorEastAsia" w:hAnsiTheme="majorHAnsi" w:cstheme="majorBidi" w:ascii="Arial Unicode MS" w:hAnsi="Arial Unicode MS" w:eastAsia="Arial Unicode MS" w:cs="Arial Unicode MS"/>
       <w:color w:val="000000" w:themeColor="text1"/>
     </w:rPr>
     <w:tblPr>
@@ -8569,7 +8574,7 @@
       <w:spacing w:after="0" w:line="240" w:lineRule="auto"/>
     </w:pPr>
     <w:rPr>
-      <w:rFonts w:asciiTheme="majorHAnsi" w:eastAsiaTheme="majorEastAsia" w:hAnsiTheme="majorHAnsi" w:cstheme="majorBidi"/>
+      <w:rFonts w:asciiTheme="majorHAnsi" w:eastAsiaTheme="majorEastAsia" w:hAnsiTheme="majorHAnsi" w:cstheme="majorBidi" w:ascii="Arial Unicode MS" w:hAnsi="Arial Unicode MS" w:eastAsia="Arial Unicode MS" w:cs="Arial Unicode MS"/>
       <w:color w:val="000000" w:themeColor="text1"/>
     </w:rPr>
     <w:tblPr>
@@ -8694,7 +8699,7 @@
       <w:spacing w:after="0" w:line="240" w:lineRule="auto"/>
     </w:pPr>
     <w:rPr>
-      <w:rFonts w:asciiTheme="majorHAnsi" w:eastAsiaTheme="majorEastAsia" w:hAnsiTheme="majorHAnsi" w:cstheme="majorBidi"/>
+      <w:rFonts w:asciiTheme="majorHAnsi" w:eastAsiaTheme="majorEastAsia" w:hAnsiTheme="majorHAnsi" w:cstheme="majorBidi" w:ascii="Arial Unicode MS" w:hAnsi="Arial Unicode MS" w:eastAsia="Arial Unicode MS" w:cs="Arial Unicode MS"/>
       <w:color w:val="000000" w:themeColor="text1"/>
     </w:rPr>
     <w:tblPr>
@@ -8819,7 +8824,7 @@
       <w:spacing w:after="0" w:line="240" w:lineRule="auto"/>
     </w:pPr>
     <w:rPr>
-      <w:rFonts w:asciiTheme="majorHAnsi" w:eastAsiaTheme="majorEastAsia" w:hAnsiTheme="majorHAnsi" w:cstheme="majorBidi"/>
+      <w:rFonts w:asciiTheme="majorHAnsi" w:eastAsiaTheme="majorEastAsia" w:hAnsiTheme="majorHAnsi" w:cstheme="majorBidi" w:ascii="Arial Unicode MS" w:hAnsi="Arial Unicode MS" w:eastAsia="Arial Unicode MS" w:cs="Arial Unicode MS"/>
       <w:color w:val="000000" w:themeColor="text1"/>
     </w:rPr>
     <w:tblPr>
@@ -8943,6 +8948,9 @@
     <w:pPr>
       <w:spacing w:after="0" w:line="240" w:lineRule="auto"/>
     </w:pPr>
+    <w:rPr>
+      <w:rFonts w:ascii="Arial Unicode MS" w:hAnsi="Arial Unicode MS" w:eastAsia="Arial Unicode MS" w:cs="Arial Unicode MS"/>
+    </w:rPr>
     <w:tblPr>
       <w:tblStyleRowBandSize w:val="1"/>
       <w:tblStyleColBandSize w:val="1"/>
@@ -9084,6 +9092,9 @@
     <w:pPr>
       <w:spacing w:after="0" w:line="240" w:lineRule="auto"/>
     </w:pPr>
+    <w:rPr>
+      <w:rFonts w:ascii="Arial Unicode MS" w:hAnsi="Arial Unicode MS" w:eastAsia="Arial Unicode MS" w:cs="Arial Unicode MS"/>
+    </w:rPr>
     <w:tblPr>
       <w:tblStyleRowBandSize w:val="1"/>
       <w:tblStyleColBandSize w:val="1"/>
@@ -9225,6 +9236,9 @@
     <w:pPr>
       <w:spacing w:after="0" w:line="240" w:lineRule="auto"/>
     </w:pPr>
+    <w:rPr>
+      <w:rFonts w:ascii="Arial Unicode MS" w:hAnsi="Arial Unicode MS" w:eastAsia="Arial Unicode MS" w:cs="Arial Unicode MS"/>
+    </w:rPr>
     <w:tblPr>
       <w:tblStyleRowBandSize w:val="1"/>
       <w:tblStyleColBandSize w:val="1"/>
@@ -9366,6 +9380,9 @@
     <w:pPr>
       <w:spacing w:after="0" w:line="240" w:lineRule="auto"/>
     </w:pPr>
+    <w:rPr>
+      <w:rFonts w:ascii="Arial Unicode MS" w:hAnsi="Arial Unicode MS" w:eastAsia="Arial Unicode MS" w:cs="Arial Unicode MS"/>
+    </w:rPr>
     <w:tblPr>
       <w:tblStyleRowBandSize w:val="1"/>
       <w:tblStyleColBandSize w:val="1"/>
@@ -9507,6 +9524,9 @@
     <w:pPr>
       <w:spacing w:after="0" w:line="240" w:lineRule="auto"/>
     </w:pPr>
+    <w:rPr>
+      <w:rFonts w:ascii="Arial Unicode MS" w:hAnsi="Arial Unicode MS" w:eastAsia="Arial Unicode MS" w:cs="Arial Unicode MS"/>
+    </w:rPr>
     <w:tblPr>
       <w:tblStyleRowBandSize w:val="1"/>
       <w:tblStyleColBandSize w:val="1"/>
@@ -9648,6 +9668,9 @@
     <w:pPr>
       <w:spacing w:after="0" w:line="240" w:lineRule="auto"/>
     </w:pPr>
+    <w:rPr>
+      <w:rFonts w:ascii="Arial Unicode MS" w:hAnsi="Arial Unicode MS" w:eastAsia="Arial Unicode MS" w:cs="Arial Unicode MS"/>
+    </w:rPr>
     <w:tblPr>
       <w:tblStyleRowBandSize w:val="1"/>
       <w:tblStyleColBandSize w:val="1"/>
@@ -9789,6 +9812,9 @@
     <w:pPr>
       <w:spacing w:after="0" w:line="240" w:lineRule="auto"/>
     </w:pPr>
+    <w:rPr>
+      <w:rFonts w:ascii="Arial Unicode MS" w:hAnsi="Arial Unicode MS" w:eastAsia="Arial Unicode MS" w:cs="Arial Unicode MS"/>
+    </w:rPr>
     <w:tblPr>
       <w:tblStyleRowBandSize w:val="1"/>
       <w:tblStyleColBandSize w:val="1"/>
@@ -9931,6 +9957,7 @@
       <w:spacing w:after="0" w:line="240" w:lineRule="auto"/>
     </w:pPr>
     <w:rPr>
+      <w:rFonts w:ascii="Arial Unicode MS" w:hAnsi="Arial Unicode MS" w:eastAsia="Arial Unicode MS" w:cs="Arial Unicode MS"/>
       <w:color w:val="FFFFFF" w:themeColor="background1"/>
     </w:rPr>
     <w:tblPr>
@@ -10045,6 +10072,7 @@
       <w:spacing w:after="0" w:line="240" w:lineRule="auto"/>
     </w:pPr>
     <w:rPr>
+      <w:rFonts w:ascii="Arial Unicode MS" w:hAnsi="Arial Unicode MS" w:eastAsia="Arial Unicode MS" w:cs="Arial Unicode MS"/>
       <w:color w:val="FFFFFF" w:themeColor="background1"/>
     </w:rPr>
     <w:tblPr>
@@ -10159,6 +10187,7 @@
       <w:spacing w:after="0" w:line="240" w:lineRule="auto"/>
     </w:pPr>
     <w:rPr>
+      <w:rFonts w:ascii="Arial Unicode MS" w:hAnsi="Arial Unicode MS" w:eastAsia="Arial Unicode MS" w:cs="Arial Unicode MS"/>
       <w:color w:val="FFFFFF" w:themeColor="background1"/>
     </w:rPr>
     <w:tblPr>
@@ -10273,6 +10302,7 @@
       <w:spacing w:after="0" w:line="240" w:lineRule="auto"/>
     </w:pPr>
     <w:rPr>
+      <w:rFonts w:ascii="Arial Unicode MS" w:hAnsi="Arial Unicode MS" w:eastAsia="Arial Unicode MS" w:cs="Arial Unicode MS"/>
       <w:color w:val="FFFFFF" w:themeColor="background1"/>
     </w:rPr>
     <w:tblPr>
@@ -10387,6 +10417,7 @@
       <w:spacing w:after="0" w:line="240" w:lineRule="auto"/>
     </w:pPr>
     <w:rPr>
+      <w:rFonts w:ascii="Arial Unicode MS" w:hAnsi="Arial Unicode MS" w:eastAsia="Arial Unicode MS" w:cs="Arial Unicode MS"/>
       <w:color w:val="FFFFFF" w:themeColor="background1"/>
     </w:rPr>
     <w:tblPr>
@@ -10501,6 +10532,7 @@
       <w:spacing w:after="0" w:line="240" w:lineRule="auto"/>
     </w:pPr>
     <w:rPr>
+      <w:rFonts w:ascii="Arial Unicode MS" w:hAnsi="Arial Unicode MS" w:eastAsia="Arial Unicode MS" w:cs="Arial Unicode MS"/>
       <w:color w:val="FFFFFF" w:themeColor="background1"/>
     </w:rPr>
     <w:tblPr>
@@ -10615,6 +10647,7 @@
       <w:spacing w:after="0" w:line="240" w:lineRule="auto"/>
     </w:pPr>
     <w:rPr>
+      <w:rFonts w:ascii="Arial Unicode MS" w:hAnsi="Arial Unicode MS" w:eastAsia="Arial Unicode MS" w:cs="Arial Unicode MS"/>
       <w:color w:val="FFFFFF" w:themeColor="background1"/>
     </w:rPr>
     <w:tblPr>
@@ -10729,6 +10762,7 @@
       <w:spacing w:after="0" w:line="240" w:lineRule="auto"/>
     </w:pPr>
     <w:rPr>
+      <w:rFonts w:ascii="Arial Unicode MS" w:hAnsi="Arial Unicode MS" w:eastAsia="Arial Unicode MS" w:cs="Arial Unicode MS"/>
       <w:color w:val="000000" w:themeColor="text1"/>
     </w:rPr>
     <w:tblPr>
@@ -10851,6 +10885,7 @@
       <w:spacing w:after="0" w:line="240" w:lineRule="auto"/>
     </w:pPr>
     <w:rPr>
+      <w:rFonts w:ascii="Arial Unicode MS" w:hAnsi="Arial Unicode MS" w:eastAsia="Arial Unicode MS" w:cs="Arial Unicode MS"/>
       <w:color w:val="000000" w:themeColor="text1"/>
     </w:rPr>
     <w:tblPr>
@@ -10973,6 +11008,7 @@
       <w:spacing w:after="0" w:line="240" w:lineRule="auto"/>
     </w:pPr>
     <w:rPr>
+      <w:rFonts w:ascii="Arial Unicode MS" w:hAnsi="Arial Unicode MS" w:eastAsia="Arial Unicode MS" w:cs="Arial Unicode MS"/>
       <w:color w:val="000000" w:themeColor="text1"/>
     </w:rPr>
     <w:tblPr>
@@ -11095,6 +11131,7 @@
       <w:spacing w:after="0" w:line="240" w:lineRule="auto"/>
     </w:pPr>
     <w:rPr>
+      <w:rFonts w:ascii="Arial Unicode MS" w:hAnsi="Arial Unicode MS" w:eastAsia="Arial Unicode MS" w:cs="Arial Unicode MS"/>
       <w:color w:val="000000" w:themeColor="text1"/>
     </w:rPr>
     <w:tblPr>
@@ -11207,6 +11244,7 @@
       <w:spacing w:after="0" w:line="240" w:lineRule="auto"/>
     </w:pPr>
     <w:rPr>
+      <w:rFonts w:ascii="Arial Unicode MS" w:hAnsi="Arial Unicode MS" w:eastAsia="Arial Unicode MS" w:cs="Arial Unicode MS"/>
       <w:color w:val="000000" w:themeColor="text1"/>
     </w:rPr>
     <w:tblPr>
@@ -11329,6 +11367,7 @@
       <w:spacing w:after="0" w:line="240" w:lineRule="auto"/>
     </w:pPr>
     <w:rPr>
+      <w:rFonts w:ascii="Arial Unicode MS" w:hAnsi="Arial Unicode MS" w:eastAsia="Arial Unicode MS" w:cs="Arial Unicode MS"/>
       <w:color w:val="000000" w:themeColor="text1"/>
     </w:rPr>
     <w:tblPr>
@@ -11451,6 +11490,7 @@
       <w:spacing w:after="0" w:line="240" w:lineRule="auto"/>
     </w:pPr>
     <w:rPr>
+      <w:rFonts w:ascii="Arial Unicode MS" w:hAnsi="Arial Unicode MS" w:eastAsia="Arial Unicode MS" w:cs="Arial Unicode MS"/>
       <w:color w:val="000000" w:themeColor="text1"/>
     </w:rPr>
     <w:tblPr>
@@ -11573,6 +11613,7 @@
       <w:spacing w:after="0" w:line="240" w:lineRule="auto"/>
     </w:pPr>
     <w:rPr>
+      <w:rFonts w:ascii="Arial Unicode MS" w:hAnsi="Arial Unicode MS" w:eastAsia="Arial Unicode MS" w:cs="Arial Unicode MS"/>
       <w:color w:val="000000" w:themeColor="text1"/>
     </w:rPr>
     <w:tblPr>
@@ -11659,6 +11700,7 @@
       <w:spacing w:after="0" w:line="240" w:lineRule="auto"/>
     </w:pPr>
     <w:rPr>
+      <w:rFonts w:ascii="Arial Unicode MS" w:hAnsi="Arial Unicode MS" w:eastAsia="Arial Unicode MS" w:cs="Arial Unicode MS"/>
       <w:color w:val="000000" w:themeColor="text1"/>
     </w:rPr>
     <w:tblPr>
@@ -11745,6 +11787,7 @@
       <w:spacing w:after="0" w:line="240" w:lineRule="auto"/>
     </w:pPr>
     <w:rPr>
+      <w:rFonts w:ascii="Arial Unicode MS" w:hAnsi="Arial Unicode MS" w:eastAsia="Arial Unicode MS" w:cs="Arial Unicode MS"/>
       <w:color w:val="000000" w:themeColor="text1"/>
     </w:rPr>
     <w:tblPr>
@@ -11831,6 +11874,7 @@
       <w:spacing w:after="0" w:line="240" w:lineRule="auto"/>
     </w:pPr>
     <w:rPr>
+      <w:rFonts w:ascii="Arial Unicode MS" w:hAnsi="Arial Unicode MS" w:eastAsia="Arial Unicode MS" w:cs="Arial Unicode MS"/>
       <w:color w:val="000000" w:themeColor="text1"/>
     </w:rPr>
     <w:tblPr>
@@ -11917,6 +11961,7 @@
       <w:spacing w:after="0" w:line="240" w:lineRule="auto"/>
     </w:pPr>
     <w:rPr>
+      <w:rFonts w:ascii="Arial Unicode MS" w:hAnsi="Arial Unicode MS" w:eastAsia="Arial Unicode MS" w:cs="Arial Unicode MS"/>
       <w:color w:val="000000" w:themeColor="text1"/>
     </w:rPr>
     <w:tblPr>
@@ -12003,6 +12048,7 @@
       <w:spacing w:after="0" w:line="240" w:lineRule="auto"/>
     </w:pPr>
     <w:rPr>
+      <w:rFonts w:ascii="Arial Unicode MS" w:hAnsi="Arial Unicode MS" w:eastAsia="Arial Unicode MS" w:cs="Arial Unicode MS"/>
       <w:color w:val="000000" w:themeColor="text1"/>
     </w:rPr>
     <w:tblPr>
@@ -12089,6 +12135,7 @@
       <w:spacing w:after="0" w:line="240" w:lineRule="auto"/>
     </w:pPr>
     <w:rPr>
+      <w:rFonts w:ascii="Arial Unicode MS" w:hAnsi="Arial Unicode MS" w:eastAsia="Arial Unicode MS" w:cs="Arial Unicode MS"/>
       <w:color w:val="000000" w:themeColor="text1"/>
     </w:rPr>
     <w:tblPr>
@@ -12175,6 +12222,7 @@
       <w:spacing w:after="0" w:line="240" w:lineRule="auto"/>
     </w:pPr>
     <w:rPr>
+      <w:rFonts w:ascii="Arial Unicode MS" w:hAnsi="Arial Unicode MS" w:eastAsia="Arial Unicode MS" w:cs="Arial Unicode MS"/>
       <w:color w:val="000000" w:themeColor="text1"/>
     </w:rPr>
     <w:tblPr>
@@ -12255,6 +12303,7 @@
       <w:spacing w:after="0" w:line="240" w:lineRule="auto"/>
     </w:pPr>
     <w:rPr>
+      <w:rFonts w:ascii="Arial Unicode MS" w:hAnsi="Arial Unicode MS" w:eastAsia="Arial Unicode MS" w:cs="Arial Unicode MS"/>
       <w:color w:val="000000" w:themeColor="text1"/>
     </w:rPr>
     <w:tblPr>
@@ -12335,6 +12384,7 @@
       <w:spacing w:after="0" w:line="240" w:lineRule="auto"/>
     </w:pPr>
     <w:rPr>
+      <w:rFonts w:ascii="Arial Unicode MS" w:hAnsi="Arial Unicode MS" w:eastAsia="Arial Unicode MS" w:cs="Arial Unicode MS"/>
       <w:color w:val="000000" w:themeColor="text1"/>
     </w:rPr>
     <w:tblPr>
@@ -12415,6 +12465,7 @@
       <w:spacing w:after="0" w:line="240" w:lineRule="auto"/>
     </w:pPr>
     <w:rPr>
+      <w:rFonts w:ascii="Arial Unicode MS" w:hAnsi="Arial Unicode MS" w:eastAsia="Arial Unicode MS" w:cs="Arial Unicode MS"/>
       <w:color w:val="000000" w:themeColor="text1"/>
     </w:rPr>
     <w:tblPr>
@@ -12495,6 +12546,7 @@
       <w:spacing w:after="0" w:line="240" w:lineRule="auto"/>
     </w:pPr>
     <w:rPr>
+      <w:rFonts w:ascii="Arial Unicode MS" w:hAnsi="Arial Unicode MS" w:eastAsia="Arial Unicode MS" w:cs="Arial Unicode MS"/>
       <w:color w:val="000000" w:themeColor="text1"/>
     </w:rPr>
     <w:tblPr>
@@ -12575,6 +12627,7 @@
       <w:spacing w:after="0" w:line="240" w:lineRule="auto"/>
     </w:pPr>
     <w:rPr>
+      <w:rFonts w:ascii="Arial Unicode MS" w:hAnsi="Arial Unicode MS" w:eastAsia="Arial Unicode MS" w:cs="Arial Unicode MS"/>
       <w:color w:val="000000" w:themeColor="text1"/>
     </w:rPr>
     <w:tblPr>
@@ -12655,6 +12708,7 @@
       <w:spacing w:after="0" w:line="240" w:lineRule="auto"/>
     </w:pPr>
     <w:rPr>
+      <w:rFonts w:ascii="Arial Unicode MS" w:hAnsi="Arial Unicode MS" w:eastAsia="Arial Unicode MS" w:cs="Arial Unicode MS"/>
       <w:color w:val="000000" w:themeColor="text1"/>
     </w:rPr>
     <w:tblPr>

</xml_diff>